<commit_message>
Deploy site 2026-09-30 11:37:37
</commit_message>
<xml_diff>
--- a/cv.docx
+++ b/cv.docx
@@ -773,9 +773,18 @@
           <w:rFonts w:ascii="Arial" w:hAnsi="Arial" w:cs="Arial"/>
           <w:szCs w:val="24"/>
         </w:rPr>
-        <w:t>the SCALLOP-Seq(</w:t>
+        <w:t>the SCALLOP-</w:t>
+      </w:r>
+      <w:proofErr w:type="gramStart"/>
+      <w:r>
+        <w:rPr>
+          <w:rFonts w:ascii="Arial" w:hAnsi="Arial" w:cs="Arial"/>
+          <w:szCs w:val="24"/>
+        </w:rPr>
+        <w:t>Seq(</w:t>
       </w:r>
       <w:proofErr w:type="spellStart"/>
+      <w:proofErr w:type="gramEnd"/>
       <w:r>
         <w:rPr>
           <w:rFonts w:ascii="Arial" w:hAnsi="Arial" w:cs="Arial"/>
@@ -876,6 +885,7 @@
         </w:rPr>
         <w:t xml:space="preserve">in </w:t>
       </w:r>
+      <w:proofErr w:type="gramStart"/>
       <w:r>
         <w:rPr>
           <w:rFonts w:ascii="Arial" w:hAnsi="Arial" w:cs="Arial"/>
@@ -909,7 +919,15 @@
           <w:rFonts w:ascii="Arial" w:hAnsi="Arial" w:cs="Arial"/>
           <w:szCs w:val="24"/>
         </w:rPr>
-        <w:t>Computational-Statistics</w:t>
+        <w:t>Computational</w:t>
+      </w:r>
+      <w:proofErr w:type="gramEnd"/>
+      <w:r>
+        <w:rPr>
+          <w:rFonts w:ascii="Arial" w:hAnsi="Arial" w:cs="Arial"/>
+          <w:szCs w:val="24"/>
+        </w:rPr>
+        <w:t>-Statistics</w:t>
       </w:r>
       <w:r>
         <w:rPr>
@@ -1661,13 +1679,23 @@
         </w:rPr>
         <w:t xml:space="preserve"> M, et al. </w:t>
       </w:r>
+      <w:proofErr w:type="gramStart"/>
       <w:r>
         <w:rPr>
           <w:rFonts w:ascii="Arial" w:hAnsi="Arial" w:cs="Arial"/>
           <w:szCs w:val="24"/>
           <w:lang w:val="en-GB"/>
         </w:rPr>
-        <w:t xml:space="preserve">Multi-cohort proteogenomic analyses reveal genetic effects across the proteome and </w:t>
+        <w:t>Multi-cohort</w:t>
+      </w:r>
+      <w:proofErr w:type="gramEnd"/>
+      <w:r>
+        <w:rPr>
+          <w:rFonts w:ascii="Arial" w:hAnsi="Arial" w:cs="Arial"/>
+          <w:szCs w:val="24"/>
+          <w:lang w:val="en-GB"/>
+        </w:rPr>
+        <w:t xml:space="preserve"> proteogenomic analyses reveal genetic effects across the proteome and </w:t>
       </w:r>
       <w:proofErr w:type="spellStart"/>
       <w:r>
@@ -1891,6 +1919,7 @@
         </w:rPr>
         <w:t xml:space="preserve">Nature </w:t>
       </w:r>
+      <w:proofErr w:type="gramStart"/>
       <w:r>
         <w:rPr>
           <w:rFonts w:ascii="Arial" w:hAnsi="Arial" w:cs="Arial"/>
@@ -1911,6 +1940,7 @@
         </w:rPr>
         <w:t>:</w:t>
       </w:r>
+      <w:proofErr w:type="gramEnd"/>
       <w:r>
         <w:rPr>
           <w:rFonts w:ascii="Arial" w:hAnsi="Arial" w:cs="Arial"/>
@@ -1918,14 +1948,32 @@
           <w:szCs w:val="24"/>
           <w:lang w:val="fr-FR"/>
         </w:rPr>
-        <w:t>472–477 (2021)</w:t>
-      </w:r>
-      <w:r>
-        <w:rPr>
-          <w:rFonts w:ascii="Arial" w:hAnsi="Arial" w:cs="Arial"/>
-          <w:szCs w:val="24"/>
-        </w:rPr>
-        <w:t xml:space="preserve">; </w:t>
+        <w:t>472–477 (2021</w:t>
+      </w:r>
+      <w:proofErr w:type="gramStart"/>
+      <w:r>
+        <w:rPr>
+          <w:rFonts w:ascii="Arial" w:hAnsi="Arial" w:cs="Arial"/>
+          <w:iCs/>
+          <w:szCs w:val="24"/>
+          <w:lang w:val="fr-FR"/>
+        </w:rPr>
+        <w:t>)</w:t>
+      </w:r>
+      <w:r>
+        <w:rPr>
+          <w:rFonts w:ascii="Arial" w:hAnsi="Arial" w:cs="Arial"/>
+          <w:szCs w:val="24"/>
+        </w:rPr>
+        <w:t>;</w:t>
+      </w:r>
+      <w:proofErr w:type="gramEnd"/>
+      <w:r>
+        <w:rPr>
+          <w:rFonts w:ascii="Arial" w:hAnsi="Arial" w:cs="Arial"/>
+          <w:szCs w:val="24"/>
+        </w:rPr>
+        <w:t xml:space="preserve"> </w:t>
       </w:r>
       <w:r>
         <w:rPr>
@@ -1950,6 +1998,7 @@
         </w:rPr>
         <w:t xml:space="preserve"> </w:t>
       </w:r>
+      <w:proofErr w:type="gramStart"/>
       <w:r>
         <w:rPr>
           <w:rStyle w:val="markedcontent"/>
@@ -1971,7 +2020,15 @@
           <w:rStyle w:val="markedcontent"/>
           <w:rFonts w:ascii="Arial" w:hAnsi="Arial" w:cs="Arial"/>
         </w:rPr>
-        <w:t>E1-E10 (2022)</w:t>
+        <w:t>E</w:t>
+      </w:r>
+      <w:proofErr w:type="gramEnd"/>
+      <w:r>
+        <w:rPr>
+          <w:rStyle w:val="markedcontent"/>
+          <w:rFonts w:ascii="Arial" w:hAnsi="Arial" w:cs="Arial"/>
+        </w:rPr>
+        <w:t>1-E10 (2022)</w:t>
       </w:r>
       <w:r>
         <w:rPr>
@@ -2006,6 +2063,7 @@
         </w:rPr>
         <w:t xml:space="preserve"> </w:t>
       </w:r>
+      <w:proofErr w:type="gramStart"/>
       <w:r>
         <w:rPr>
           <w:rFonts w:ascii="Arial" w:hAnsi="Arial" w:cs="Arial"/>
@@ -2030,7 +2088,16 @@
           <w:szCs w:val="24"/>
           <w:lang w:val="en-GB" w:eastAsia="zh-CN"/>
         </w:rPr>
-        <w:t>E7–E26 (2023)</w:t>
+        <w:t>E</w:t>
+      </w:r>
+      <w:proofErr w:type="gramEnd"/>
+      <w:r>
+        <w:rPr>
+          <w:rFonts w:ascii="Arial" w:hAnsi="Arial" w:cs="Arial"/>
+          <w:szCs w:val="24"/>
+          <w:lang w:val="en-GB" w:eastAsia="zh-CN"/>
+        </w:rPr>
+        <w:t>7–E26 (2023)</w:t>
       </w:r>
       <w:r>
         <w:rPr>
@@ -2162,7 +2229,27 @@
           <w:szCs w:val="24"/>
           <w:lang w:eastAsia="zh-CN"/>
         </w:rPr>
-        <w:t>: 10.18637/jss.v085.i06</w:t>
+        <w:t>: 10.18637/</w:t>
+      </w:r>
+      <w:proofErr w:type="gramStart"/>
+      <w:r>
+        <w:rPr>
+          <w:rFonts w:ascii="Arial" w:hAnsi="Arial" w:cs="Arial"/>
+          <w:iCs/>
+          <w:szCs w:val="24"/>
+          <w:lang w:eastAsia="zh-CN"/>
+        </w:rPr>
+        <w:t>jss.v085.i</w:t>
+      </w:r>
+      <w:proofErr w:type="gramEnd"/>
+      <w:r>
+        <w:rPr>
+          <w:rFonts w:ascii="Arial" w:hAnsi="Arial" w:cs="Arial"/>
+          <w:iCs/>
+          <w:szCs w:val="24"/>
+          <w:lang w:eastAsia="zh-CN"/>
+        </w:rPr>
+        <w:t>06</w:t>
       </w:r>
       <w:r>
         <w:rPr>
@@ -2553,7 +2640,23 @@
           <w:rFonts w:ascii="Arial" w:hAnsi="Arial" w:cs="Arial"/>
           <w:szCs w:val="24"/>
         </w:rPr>
-        <w:t>10.18637/jss.v023.i08.</w:t>
+        <w:t>10.18637/</w:t>
+      </w:r>
+      <w:proofErr w:type="gramStart"/>
+      <w:r>
+        <w:rPr>
+          <w:rFonts w:ascii="Arial" w:hAnsi="Arial" w:cs="Arial"/>
+          <w:szCs w:val="24"/>
+        </w:rPr>
+        <w:t>jss.v023.i</w:t>
+      </w:r>
+      <w:proofErr w:type="gramEnd"/>
+      <w:r>
+        <w:rPr>
+          <w:rFonts w:ascii="Arial" w:hAnsi="Arial" w:cs="Arial"/>
+          <w:szCs w:val="24"/>
+        </w:rPr>
+        <w:t>08.</w:t>
       </w:r>
     </w:p>
     <w:p>
@@ -2626,6 +2729,7 @@
         </w:rPr>
         <w:t xml:space="preserve"> F, et al. </w:t>
       </w:r>
+      <w:proofErr w:type="gramStart"/>
       <w:r>
         <w:rPr>
           <w:rFonts w:ascii="Arial" w:hAnsi="Arial" w:cs="Arial"/>
@@ -2633,7 +2737,17 @@
           <w:szCs w:val="24"/>
           <w:lang w:eastAsia="zh-CN"/>
         </w:rPr>
-        <w:t xml:space="preserve">Multi-ancestry genome-wide association study identifies new asthma susceptibility loci that co-localize with immune cell enhancer histone marks. </w:t>
+        <w:t>Multi-ancestry</w:t>
+      </w:r>
+      <w:proofErr w:type="gramEnd"/>
+      <w:r>
+        <w:rPr>
+          <w:rFonts w:ascii="Arial" w:hAnsi="Arial" w:cs="Arial"/>
+          <w:bCs/>
+          <w:szCs w:val="24"/>
+          <w:lang w:eastAsia="zh-CN"/>
+        </w:rPr>
+        <w:t xml:space="preserve"> genome-wide association study identifies new asthma susceptibility loci that co-localize with immune cell enhancer histone marks. </w:t>
       </w:r>
       <w:r>
         <w:rPr>
@@ -2936,7 +3050,27 @@
           <w:szCs w:val="24"/>
           <w:lang w:eastAsia="zh-CN"/>
         </w:rPr>
-        <w:t>: 10.18637/jss.v085.i06</w:t>
+        <w:t>: 10.18637/</w:t>
+      </w:r>
+      <w:proofErr w:type="gramStart"/>
+      <w:r>
+        <w:rPr>
+          <w:rFonts w:ascii="Arial" w:hAnsi="Arial" w:cs="Arial"/>
+          <w:iCs/>
+          <w:szCs w:val="24"/>
+          <w:lang w:eastAsia="zh-CN"/>
+        </w:rPr>
+        <w:t>jss.v085.i</w:t>
+      </w:r>
+      <w:proofErr w:type="gramEnd"/>
+      <w:r>
+        <w:rPr>
+          <w:rFonts w:ascii="Arial" w:hAnsi="Arial" w:cs="Arial"/>
+          <w:iCs/>
+          <w:szCs w:val="24"/>
+          <w:lang w:eastAsia="zh-CN"/>
+        </w:rPr>
+        <w:t>06</w:t>
       </w:r>
       <w:r>
         <w:rPr>
@@ -2991,7 +3125,23 @@
           <w:rFonts w:ascii="Arial" w:hAnsi="Arial" w:cs="Arial"/>
           <w:szCs w:val="24"/>
         </w:rPr>
-        <w:t xml:space="preserve"> 2018, 13(6):e0198166. </w:t>
+        <w:t xml:space="preserve"> 2018, 13(6</w:t>
+      </w:r>
+      <w:proofErr w:type="gramStart"/>
+      <w:r>
+        <w:rPr>
+          <w:rFonts w:ascii="Arial" w:hAnsi="Arial" w:cs="Arial"/>
+          <w:szCs w:val="24"/>
+        </w:rPr>
+        <w:t>):e</w:t>
+      </w:r>
+      <w:proofErr w:type="gramEnd"/>
+      <w:r>
+        <w:rPr>
+          <w:rFonts w:ascii="Arial" w:hAnsi="Arial" w:cs="Arial"/>
+          <w:szCs w:val="24"/>
+        </w:rPr>
+        <w:t xml:space="preserve">0198166. </w:t>
       </w:r>
       <w:r>
         <w:rPr>
@@ -3285,12 +3435,21 @@
         </w:rPr>
         <w:t xml:space="preserve">Kilpeläinen TO, et al. </w:t>
       </w:r>
-      <w:r>
-        <w:rPr>
-          <w:rFonts w:ascii="Arial" w:hAnsi="Arial" w:cs="Arial"/>
-          <w:szCs w:val="24"/>
-        </w:rPr>
-        <w:t xml:space="preserve">Multi-ancestry study of blood lipid levels identifies four loci interacting with physical activity. </w:t>
+      <w:proofErr w:type="gramStart"/>
+      <w:r>
+        <w:rPr>
+          <w:rFonts w:ascii="Arial" w:hAnsi="Arial" w:cs="Arial"/>
+          <w:szCs w:val="24"/>
+        </w:rPr>
+        <w:t>Multi-ancestry</w:t>
+      </w:r>
+      <w:proofErr w:type="gramEnd"/>
+      <w:r>
+        <w:rPr>
+          <w:rFonts w:ascii="Arial" w:hAnsi="Arial" w:cs="Arial"/>
+          <w:szCs w:val="24"/>
+        </w:rPr>
+        <w:t xml:space="preserve"> study of blood lipid levels identifies four loci interacting with physical activity. </w:t>
       </w:r>
       <w:r>
         <w:rPr>
@@ -3496,12 +3655,21 @@
         </w:rPr>
         <w:t xml:space="preserve">de Vries PS, et al. </w:t>
       </w:r>
-      <w:r>
-        <w:rPr>
-          <w:rFonts w:ascii="Arial" w:hAnsi="Arial" w:cs="Arial"/>
-          <w:szCs w:val="24"/>
-        </w:rPr>
-        <w:t>Multi-ancestry genome-wide association study of lipid levels incorporating gene-alcohol interactions</w:t>
+      <w:proofErr w:type="gramStart"/>
+      <w:r>
+        <w:rPr>
+          <w:rFonts w:ascii="Arial" w:hAnsi="Arial" w:cs="Arial"/>
+          <w:szCs w:val="24"/>
+        </w:rPr>
+        <w:t>Multi-ancestry</w:t>
+      </w:r>
+      <w:proofErr w:type="gramEnd"/>
+      <w:r>
+        <w:rPr>
+          <w:rFonts w:ascii="Arial" w:hAnsi="Arial" w:cs="Arial"/>
+          <w:szCs w:val="24"/>
+        </w:rPr>
+        <w:t xml:space="preserve"> genome-wide association study of lipid levels incorporating gene-alcohol interactions</w:t>
       </w:r>
       <w:r>
         <w:rPr>
@@ -3997,7 +4165,23 @@
           <w:rFonts w:ascii="Arial" w:hAnsi="Arial" w:cs="Arial"/>
           <w:szCs w:val="24"/>
         </w:rPr>
-        <w:t xml:space="preserve"> Multi-ancestry genome-wide gene–smoking interaction study of 387,272 individuals identifies new loci associated with serum lipids. </w:t>
+        <w:t xml:space="preserve"> </w:t>
+      </w:r>
+      <w:proofErr w:type="gramStart"/>
+      <w:r>
+        <w:rPr>
+          <w:rFonts w:ascii="Arial" w:hAnsi="Arial" w:cs="Arial"/>
+          <w:szCs w:val="24"/>
+        </w:rPr>
+        <w:t>Multi-ancestry</w:t>
+      </w:r>
+      <w:proofErr w:type="gramEnd"/>
+      <w:r>
+        <w:rPr>
+          <w:rFonts w:ascii="Arial" w:hAnsi="Arial" w:cs="Arial"/>
+          <w:szCs w:val="24"/>
+        </w:rPr>
+        <w:t xml:space="preserve"> genome-wide gene–smoking interaction study of 387,272 individuals identifies new loci associated with serum lipids. </w:t>
       </w:r>
       <w:r>
         <w:rPr>
@@ -5214,12 +5398,21 @@
         </w:rPr>
         <w:t xml:space="preserve">Shrine N, et al. </w:t>
       </w:r>
-      <w:r>
-        <w:rPr>
-          <w:rFonts w:ascii="Arial" w:hAnsi="Arial" w:cs="Arial"/>
-          <w:szCs w:val="24"/>
-        </w:rPr>
-        <w:t xml:space="preserve">Multi-ancestry genome-wide association study improves resolution of genes, pathways and pleiotropy for lung function and chronic obstructive pulmonary disease. </w:t>
+      <w:proofErr w:type="gramStart"/>
+      <w:r>
+        <w:rPr>
+          <w:rFonts w:ascii="Arial" w:hAnsi="Arial" w:cs="Arial"/>
+          <w:szCs w:val="24"/>
+        </w:rPr>
+        <w:t>Multi-ancestry</w:t>
+      </w:r>
+      <w:proofErr w:type="gramEnd"/>
+      <w:r>
+        <w:rPr>
+          <w:rFonts w:ascii="Arial" w:hAnsi="Arial" w:cs="Arial"/>
+          <w:szCs w:val="24"/>
+        </w:rPr>
+        <w:t xml:space="preserve"> genome-wide association study improves resolution of genes, pathways and pleiotropy for lung function and chronic obstructive pulmonary disease. </w:t>
       </w:r>
       <w:r>
         <w:rPr>
@@ -5619,6 +5812,7 @@
         </w:rPr>
         <w:t xml:space="preserve"> </w:t>
       </w:r>
+      <w:proofErr w:type="gramStart"/>
       <w:r>
         <w:rPr>
           <w:rFonts w:ascii="Arial" w:hAnsi="Arial" w:cs="Arial"/>
@@ -5645,7 +5839,16 @@
           <w:szCs w:val="24"/>
           <w:lang w:eastAsia="zh-CN"/>
         </w:rPr>
-        <w:t>E7–E26 (2023).</w:t>
+        <w:t>E</w:t>
+      </w:r>
+      <w:proofErr w:type="gramEnd"/>
+      <w:r>
+        <w:rPr>
+          <w:rFonts w:ascii="Arial" w:hAnsi="Arial" w:cs="Arial"/>
+          <w:szCs w:val="24"/>
+          <w:lang w:eastAsia="zh-CN"/>
+        </w:rPr>
+        <w:t>7–E26 (2023).</w:t>
       </w:r>
     </w:p>
     <w:p>
@@ -6140,13 +6343,23 @@
         </w:rPr>
         <w:t xml:space="preserve"> M, et al. </w:t>
       </w:r>
+      <w:proofErr w:type="gramStart"/>
       <w:r>
         <w:rPr>
           <w:rFonts w:ascii="Arial" w:hAnsi="Arial" w:cs="Arial"/>
           <w:szCs w:val="24"/>
           <w:lang w:val="en-GB"/>
         </w:rPr>
-        <w:t xml:space="preserve">Multi-cohort proteogenomic analyses reveal genetic effects across the proteome and </w:t>
+        <w:t>Multi-cohort</w:t>
+      </w:r>
+      <w:proofErr w:type="gramEnd"/>
+      <w:r>
+        <w:rPr>
+          <w:rFonts w:ascii="Arial" w:hAnsi="Arial" w:cs="Arial"/>
+          <w:szCs w:val="24"/>
+          <w:lang w:val="en-GB"/>
+        </w:rPr>
+        <w:t xml:space="preserve"> proteogenomic analyses reveal genetic effects across the proteome and </w:t>
       </w:r>
       <w:proofErr w:type="spellStart"/>
       <w:r>
@@ -6213,8 +6426,13 @@
           <w:numId w:val="28"/>
         </w:numPr>
         <w:rPr>
-          <w:rFonts w:ascii="Arial" w:hAnsi="Arial" w:cs="Arial"/>
-          <w:szCs w:val="24"/>
+          <w:rFonts w:ascii="Arial-BoldMT" w:eastAsia="Times New Roman" w:hAnsi="Arial-BoldMT"/>
+          <w:b/>
+          <w:bCs/>
+          <w:color w:val="000000"/>
+          <w:sz w:val="28"/>
+          <w:szCs w:val="28"/>
+          <w:lang w:val="en-GB" w:eastAsia="zh-CN"/>
         </w:rPr>
       </w:pPr>
       <w:r>
@@ -6292,12 +6510,97 @@
           <w:rFonts w:ascii="Arial" w:hAnsi="Arial" w:cs="Arial"/>
           <w:szCs w:val="24"/>
         </w:rPr>
-        <w:t>esearch</w:t>
-      </w:r>
-      <w:r>
-        <w:rPr>
-          <w:rFonts w:ascii="Arial" w:hAnsi="Arial" w:cs="Arial"/>
-          <w:szCs w:val="24"/>
+        <w:t>esearch.</w:t>
+      </w:r>
+      <w:r>
+        <w:rPr>
+          <w:rFonts w:ascii="Arial" w:hAnsi="Arial" w:cs="Arial"/>
+          <w:szCs w:val="24"/>
+        </w:rPr>
+        <w:t xml:space="preserve"> </w:t>
+      </w:r>
+    </w:p>
+    <w:p>
+      <w:pPr>
+        <w:pStyle w:val="ListParagraph"/>
+        <w:numPr>
+          <w:ilvl w:val="0"/>
+          <w:numId w:val="28"/>
+        </w:numPr>
+        <w:rPr>
+          <w:rFonts w:ascii="Arial" w:hAnsi="Arial" w:cs="Arial"/>
+          <w:szCs w:val="24"/>
+        </w:rPr>
+      </w:pPr>
+      <w:r>
+        <w:rPr>
+          <w:rFonts w:ascii="Arial" w:eastAsia="Times New Roman" w:hAnsi="Arial" w:cs="Arial"/>
+          <w:color w:val="000000"/>
+          <w:szCs w:val="24"/>
+          <w:lang w:eastAsia="zh-CN"/>
+        </w:rPr>
+        <w:t>Svenstrup</w:t>
+      </w:r>
+      <w:r>
+        <w:rPr>
+          <w:rFonts w:ascii="Arial" w:eastAsia="Times New Roman" w:hAnsi="Arial" w:cs="Arial"/>
+          <w:color w:val="000000"/>
+          <w:szCs w:val="24"/>
+          <w:lang w:eastAsia="zh-CN"/>
+        </w:rPr>
+        <w:t xml:space="preserve"> V,</w:t>
+      </w:r>
+      <w:r>
+        <w:rPr>
+          <w:rFonts w:ascii="Arial" w:eastAsia="Times New Roman" w:hAnsi="Arial" w:cs="Arial"/>
+          <w:color w:val="000000"/>
+          <w:szCs w:val="24"/>
+          <w:lang w:eastAsia="zh-CN"/>
+        </w:rPr>
+        <w:t xml:space="preserve"> </w:t>
+      </w:r>
+      <w:r>
+        <w:rPr>
+          <w:rFonts w:ascii="Arial" w:eastAsia="Times New Roman" w:hAnsi="Arial" w:cs="Arial"/>
+          <w:color w:val="000000"/>
+          <w:szCs w:val="24"/>
+          <w:lang w:eastAsia="zh-CN"/>
+        </w:rPr>
+        <w:t xml:space="preserve">et al. </w:t>
+      </w:r>
+      <w:r>
+        <w:rPr>
+          <w:rFonts w:ascii="Arial" w:eastAsia="Times New Roman" w:hAnsi="Arial" w:cs="Arial"/>
+          <w:color w:val="000000"/>
+          <w:szCs w:val="24"/>
+          <w:lang w:val="en-GB" w:eastAsia="zh-CN"/>
+        </w:rPr>
+        <w:t>Genetic architecture of body composition reveals six biologically</w:t>
+      </w:r>
+      <w:r>
+        <w:rPr>
+          <w:rFonts w:ascii="Arial" w:eastAsia="Times New Roman" w:hAnsi="Arial" w:cs="Arial"/>
+          <w:color w:val="000000"/>
+          <w:szCs w:val="24"/>
+          <w:lang w:val="en-GB" w:eastAsia="zh-CN"/>
+        </w:rPr>
+        <w:t xml:space="preserve"> </w:t>
+      </w:r>
+      <w:r>
+        <w:rPr>
+          <w:rFonts w:ascii="Arial" w:eastAsia="Times New Roman" w:hAnsi="Arial" w:cs="Arial"/>
+          <w:color w:val="000000"/>
+          <w:szCs w:val="24"/>
+          <w:lang w:val="en-GB" w:eastAsia="zh-CN"/>
+        </w:rPr>
+        <w:t>distinct body types and therapeutic opportunities</w:t>
+      </w:r>
+      <w:r>
+        <w:rPr>
+          <w:rFonts w:ascii="Arial" w:eastAsia="Times New Roman" w:hAnsi="Arial" w:cs="Arial"/>
+          <w:color w:val="000000"/>
+          <w:szCs w:val="24"/>
+          <w:lang w:val="en-GB" w:eastAsia="zh-CN"/>
         </w:rPr>
         <w:t>.</w:t>
       </w:r>
@@ -8538,7 +8841,6 @@
   <w:style w:type="character" w:default="1" w:styleId="DefaultParagraphFont">
     <w:name w:val="Default Paragraph Font"/>
     <w:uiPriority w:val="1"/>
-    <w:semiHidden/>
     <w:unhideWhenUsed/>
   </w:style>
   <w:style w:type="table" w:default="1" w:styleId="TableNormal">

</xml_diff>

<commit_message>
Deploy site 2026-10-01 13:29:29
</commit_message>
<xml_diff>
--- a/cv.docx
+++ b/cv.docx
@@ -116,14 +116,42 @@
         </w:rPr>
         <w:t>jinghuazhao@hotmail.com</w:t>
       </w:r>
-      <w:r>
+    </w:p>
+    <w:p>
+      <w:pPr>
+        <w:jc w:val="both"/>
         <w:rPr>
           <w:rFonts w:ascii="Arial" w:hAnsi="Arial" w:cs="Arial"/>
           <w:szCs w:val="24"/>
           <w:lang w:val="en-GB"/>
         </w:rPr>
-        <w:t xml:space="preserve">; </w:t>
-      </w:r>
+      </w:pPr>
+      <w:r>
+        <w:rPr>
+          <w:rFonts w:ascii="Arial" w:hAnsi="Arial" w:cs="Arial"/>
+          <w:szCs w:val="24"/>
+          <w:lang w:val="en-GB"/>
+        </w:rPr>
+        <w:t xml:space="preserve">GitHub: </w:t>
+      </w:r>
+      <w:r>
+        <w:rPr>
+          <w:rFonts w:ascii="Arial" w:hAnsi="Arial" w:cs="Arial"/>
+          <w:szCs w:val="24"/>
+          <w:lang w:val="en-GB"/>
+        </w:rPr>
+        <w:t>https://github.com/jinghuazhao/</w:t>
+      </w:r>
+    </w:p>
+    <w:p>
+      <w:pPr>
+        <w:jc w:val="both"/>
+        <w:rPr>
+          <w:rFonts w:ascii="Arial" w:hAnsi="Arial" w:cs="Arial"/>
+          <w:szCs w:val="24"/>
+          <w:lang w:val="en-GB"/>
+        </w:rPr>
+      </w:pPr>
       <w:r>
         <w:rPr>
           <w:rFonts w:ascii="Arial" w:hAnsi="Arial" w:cs="Arial"/>
@@ -773,18 +801,9 @@
           <w:rFonts w:ascii="Arial" w:hAnsi="Arial" w:cs="Arial"/>
           <w:szCs w:val="24"/>
         </w:rPr>
-        <w:t>the SCALLOP-</w:t>
-      </w:r>
-      <w:proofErr w:type="gramStart"/>
-      <w:r>
-        <w:rPr>
-          <w:rFonts w:ascii="Arial" w:hAnsi="Arial" w:cs="Arial"/>
-          <w:szCs w:val="24"/>
-        </w:rPr>
-        <w:t>Seq(</w:t>
+        <w:t>the SCALLOP-Seq(</w:t>
       </w:r>
       <w:proofErr w:type="spellStart"/>
-      <w:proofErr w:type="gramEnd"/>
       <w:r>
         <w:rPr>
           <w:rFonts w:ascii="Arial" w:hAnsi="Arial" w:cs="Arial"/>
@@ -885,7 +904,6 @@
         </w:rPr>
         <w:t xml:space="preserve">in </w:t>
       </w:r>
-      <w:proofErr w:type="gramStart"/>
       <w:r>
         <w:rPr>
           <w:rFonts w:ascii="Arial" w:hAnsi="Arial" w:cs="Arial"/>
@@ -919,15 +937,7 @@
           <w:rFonts w:ascii="Arial" w:hAnsi="Arial" w:cs="Arial"/>
           <w:szCs w:val="24"/>
         </w:rPr>
-        <w:t>Computational</w:t>
-      </w:r>
-      <w:proofErr w:type="gramEnd"/>
-      <w:r>
-        <w:rPr>
-          <w:rFonts w:ascii="Arial" w:hAnsi="Arial" w:cs="Arial"/>
-          <w:szCs w:val="24"/>
-        </w:rPr>
-        <w:t>-Statistics</w:t>
+        <w:t>Computational-Statistics</w:t>
       </w:r>
       <w:r>
         <w:rPr>
@@ -1679,23 +1689,13 @@
         </w:rPr>
         <w:t xml:space="preserve"> M, et al. </w:t>
       </w:r>
-      <w:proofErr w:type="gramStart"/>
       <w:r>
         <w:rPr>
           <w:rFonts w:ascii="Arial" w:hAnsi="Arial" w:cs="Arial"/>
           <w:szCs w:val="24"/>
           <w:lang w:val="en-GB"/>
         </w:rPr>
-        <w:t>Multi-cohort</w:t>
-      </w:r>
-      <w:proofErr w:type="gramEnd"/>
-      <w:r>
-        <w:rPr>
-          <w:rFonts w:ascii="Arial" w:hAnsi="Arial" w:cs="Arial"/>
-          <w:szCs w:val="24"/>
-          <w:lang w:val="en-GB"/>
-        </w:rPr>
-        <w:t xml:space="preserve"> proteogenomic analyses reveal genetic effects across the proteome and </w:t>
+        <w:t xml:space="preserve">Multi-cohort proteogenomic analyses reveal genetic effects across the proteome and </w:t>
       </w:r>
       <w:proofErr w:type="spellStart"/>
       <w:r>
@@ -1919,7 +1919,6 @@
         </w:rPr>
         <w:t xml:space="preserve">Nature </w:t>
       </w:r>
-      <w:proofErr w:type="gramStart"/>
       <w:r>
         <w:rPr>
           <w:rFonts w:ascii="Arial" w:hAnsi="Arial" w:cs="Arial"/>
@@ -1940,7 +1939,6 @@
         </w:rPr>
         <w:t>:</w:t>
       </w:r>
-      <w:proofErr w:type="gramEnd"/>
       <w:r>
         <w:rPr>
           <w:rFonts w:ascii="Arial" w:hAnsi="Arial" w:cs="Arial"/>
@@ -1948,32 +1946,14 @@
           <w:szCs w:val="24"/>
           <w:lang w:val="fr-FR"/>
         </w:rPr>
-        <w:t>472–477 (2021</w:t>
-      </w:r>
-      <w:proofErr w:type="gramStart"/>
-      <w:r>
-        <w:rPr>
-          <w:rFonts w:ascii="Arial" w:hAnsi="Arial" w:cs="Arial"/>
-          <w:iCs/>
-          <w:szCs w:val="24"/>
-          <w:lang w:val="fr-FR"/>
-        </w:rPr>
-        <w:t>)</w:t>
-      </w:r>
-      <w:r>
-        <w:rPr>
-          <w:rFonts w:ascii="Arial" w:hAnsi="Arial" w:cs="Arial"/>
-          <w:szCs w:val="24"/>
-        </w:rPr>
-        <w:t>;</w:t>
-      </w:r>
-      <w:proofErr w:type="gramEnd"/>
-      <w:r>
-        <w:rPr>
-          <w:rFonts w:ascii="Arial" w:hAnsi="Arial" w:cs="Arial"/>
-          <w:szCs w:val="24"/>
-        </w:rPr>
-        <w:t xml:space="preserve"> </w:t>
+        <w:t>472–477 (2021)</w:t>
+      </w:r>
+      <w:r>
+        <w:rPr>
+          <w:rFonts w:ascii="Arial" w:hAnsi="Arial" w:cs="Arial"/>
+          <w:szCs w:val="24"/>
+        </w:rPr>
+        <w:t xml:space="preserve">; </w:t>
       </w:r>
       <w:r>
         <w:rPr>
@@ -1998,7 +1978,6 @@
         </w:rPr>
         <w:t xml:space="preserve"> </w:t>
       </w:r>
-      <w:proofErr w:type="gramStart"/>
       <w:r>
         <w:rPr>
           <w:rStyle w:val="markedcontent"/>
@@ -2020,15 +1999,7 @@
           <w:rStyle w:val="markedcontent"/>
           <w:rFonts w:ascii="Arial" w:hAnsi="Arial" w:cs="Arial"/>
         </w:rPr>
-        <w:t>E</w:t>
-      </w:r>
-      <w:proofErr w:type="gramEnd"/>
-      <w:r>
-        <w:rPr>
-          <w:rStyle w:val="markedcontent"/>
-          <w:rFonts w:ascii="Arial" w:hAnsi="Arial" w:cs="Arial"/>
-        </w:rPr>
-        <w:t>1-E10 (2022)</w:t>
+        <w:t>E1-E10 (2022)</w:t>
       </w:r>
       <w:r>
         <w:rPr>
@@ -2063,7 +2034,6 @@
         </w:rPr>
         <w:t xml:space="preserve"> </w:t>
       </w:r>
-      <w:proofErr w:type="gramStart"/>
       <w:r>
         <w:rPr>
           <w:rFonts w:ascii="Arial" w:hAnsi="Arial" w:cs="Arial"/>
@@ -2088,16 +2058,7 @@
           <w:szCs w:val="24"/>
           <w:lang w:val="en-GB" w:eastAsia="zh-CN"/>
         </w:rPr>
-        <w:t>E</w:t>
-      </w:r>
-      <w:proofErr w:type="gramEnd"/>
-      <w:r>
-        <w:rPr>
-          <w:rFonts w:ascii="Arial" w:hAnsi="Arial" w:cs="Arial"/>
-          <w:szCs w:val="24"/>
-          <w:lang w:val="en-GB" w:eastAsia="zh-CN"/>
-        </w:rPr>
-        <w:t>7–E26 (2023)</w:t>
+        <w:t>E7–E26 (2023)</w:t>
       </w:r>
       <w:r>
         <w:rPr>
@@ -2229,27 +2190,7 @@
           <w:szCs w:val="24"/>
           <w:lang w:eastAsia="zh-CN"/>
         </w:rPr>
-        <w:t>: 10.18637/</w:t>
-      </w:r>
-      <w:proofErr w:type="gramStart"/>
-      <w:r>
-        <w:rPr>
-          <w:rFonts w:ascii="Arial" w:hAnsi="Arial" w:cs="Arial"/>
-          <w:iCs/>
-          <w:szCs w:val="24"/>
-          <w:lang w:eastAsia="zh-CN"/>
-        </w:rPr>
-        <w:t>jss.v085.i</w:t>
-      </w:r>
-      <w:proofErr w:type="gramEnd"/>
-      <w:r>
-        <w:rPr>
-          <w:rFonts w:ascii="Arial" w:hAnsi="Arial" w:cs="Arial"/>
-          <w:iCs/>
-          <w:szCs w:val="24"/>
-          <w:lang w:eastAsia="zh-CN"/>
-        </w:rPr>
-        <w:t>06</w:t>
+        <w:t>: 10.18637/jss.v085.i06</w:t>
       </w:r>
       <w:r>
         <w:rPr>
@@ -2376,6 +2317,7 @@
           <w:rFonts w:ascii="Arial" w:hAnsi="Arial" w:cs="Arial"/>
           <w:szCs w:val="24"/>
         </w:rPr>
+        <w:lastRenderedPageBreak/>
         <w:t xml:space="preserve">Xue F, Li S, Luan J, Yuan Z, Luben RN, Khaw K-T, Wareham NJ, Loos RJF, </w:t>
       </w:r>
       <w:r>
@@ -2470,7 +2412,6 @@
           <w:rFonts w:ascii="Arial" w:hAnsi="Arial" w:cs="Arial"/>
           <w:szCs w:val="24"/>
         </w:rPr>
-        <w:lastRenderedPageBreak/>
         <w:t xml:space="preserve">Loos RJ, </w:t>
       </w:r>
       <w:r>
@@ -2640,23 +2581,7 @@
           <w:rFonts w:ascii="Arial" w:hAnsi="Arial" w:cs="Arial"/>
           <w:szCs w:val="24"/>
         </w:rPr>
-        <w:t>10.18637/</w:t>
-      </w:r>
-      <w:proofErr w:type="gramStart"/>
-      <w:r>
-        <w:rPr>
-          <w:rFonts w:ascii="Arial" w:hAnsi="Arial" w:cs="Arial"/>
-          <w:szCs w:val="24"/>
-        </w:rPr>
-        <w:t>jss.v023.i</w:t>
-      </w:r>
-      <w:proofErr w:type="gramEnd"/>
-      <w:r>
-        <w:rPr>
-          <w:rFonts w:ascii="Arial" w:hAnsi="Arial" w:cs="Arial"/>
-          <w:szCs w:val="24"/>
-        </w:rPr>
-        <w:t>08.</w:t>
+        <w:t>10.18637/jss.v023.i08.</w:t>
       </w:r>
     </w:p>
     <w:p>
@@ -2729,7 +2654,6 @@
         </w:rPr>
         <w:t xml:space="preserve"> F, et al. </w:t>
       </w:r>
-      <w:proofErr w:type="gramStart"/>
       <w:r>
         <w:rPr>
           <w:rFonts w:ascii="Arial" w:hAnsi="Arial" w:cs="Arial"/>
@@ -2737,17 +2661,7 @@
           <w:szCs w:val="24"/>
           <w:lang w:eastAsia="zh-CN"/>
         </w:rPr>
-        <w:t>Multi-ancestry</w:t>
-      </w:r>
-      <w:proofErr w:type="gramEnd"/>
-      <w:r>
-        <w:rPr>
-          <w:rFonts w:ascii="Arial" w:hAnsi="Arial" w:cs="Arial"/>
-          <w:bCs/>
-          <w:szCs w:val="24"/>
-          <w:lang w:eastAsia="zh-CN"/>
-        </w:rPr>
-        <w:t xml:space="preserve"> genome-wide association study identifies new asthma susceptibility loci that co-localize with immune cell enhancer histone marks. </w:t>
+        <w:t xml:space="preserve">Multi-ancestry genome-wide association study identifies new asthma susceptibility loci that co-localize with immune cell enhancer histone marks. </w:t>
       </w:r>
       <w:r>
         <w:rPr>
@@ -3050,27 +2964,7 @@
           <w:szCs w:val="24"/>
           <w:lang w:eastAsia="zh-CN"/>
         </w:rPr>
-        <w:t>: 10.18637/</w:t>
-      </w:r>
-      <w:proofErr w:type="gramStart"/>
-      <w:r>
-        <w:rPr>
-          <w:rFonts w:ascii="Arial" w:hAnsi="Arial" w:cs="Arial"/>
-          <w:iCs/>
-          <w:szCs w:val="24"/>
-          <w:lang w:eastAsia="zh-CN"/>
-        </w:rPr>
-        <w:t>jss.v085.i</w:t>
-      </w:r>
-      <w:proofErr w:type="gramEnd"/>
-      <w:r>
-        <w:rPr>
-          <w:rFonts w:ascii="Arial" w:hAnsi="Arial" w:cs="Arial"/>
-          <w:iCs/>
-          <w:szCs w:val="24"/>
-          <w:lang w:eastAsia="zh-CN"/>
-        </w:rPr>
-        <w:t>06</w:t>
+        <w:t>: 10.18637/jss.v085.i06</w:t>
       </w:r>
       <w:r>
         <w:rPr>
@@ -3125,23 +3019,7 @@
           <w:rFonts w:ascii="Arial" w:hAnsi="Arial" w:cs="Arial"/>
           <w:szCs w:val="24"/>
         </w:rPr>
-        <w:t xml:space="preserve"> 2018, 13(6</w:t>
-      </w:r>
-      <w:proofErr w:type="gramStart"/>
-      <w:r>
-        <w:rPr>
-          <w:rFonts w:ascii="Arial" w:hAnsi="Arial" w:cs="Arial"/>
-          <w:szCs w:val="24"/>
-        </w:rPr>
-        <w:t>):e</w:t>
-      </w:r>
-      <w:proofErr w:type="gramEnd"/>
-      <w:r>
-        <w:rPr>
-          <w:rFonts w:ascii="Arial" w:hAnsi="Arial" w:cs="Arial"/>
-          <w:szCs w:val="24"/>
-        </w:rPr>
-        <w:t xml:space="preserve">0198166. </w:t>
+        <w:t xml:space="preserve"> 2018, 13(6):e0198166. </w:t>
       </w:r>
       <w:r>
         <w:rPr>
@@ -3435,21 +3313,12 @@
         </w:rPr>
         <w:t xml:space="preserve">Kilpeläinen TO, et al. </w:t>
       </w:r>
-      <w:proofErr w:type="gramStart"/>
-      <w:r>
-        <w:rPr>
-          <w:rFonts w:ascii="Arial" w:hAnsi="Arial" w:cs="Arial"/>
-          <w:szCs w:val="24"/>
-        </w:rPr>
-        <w:t>Multi-ancestry</w:t>
-      </w:r>
-      <w:proofErr w:type="gramEnd"/>
-      <w:r>
-        <w:rPr>
-          <w:rFonts w:ascii="Arial" w:hAnsi="Arial" w:cs="Arial"/>
-          <w:szCs w:val="24"/>
-        </w:rPr>
-        <w:t xml:space="preserve"> study of blood lipid levels identifies four loci interacting with physical activity. </w:t>
+      <w:r>
+        <w:rPr>
+          <w:rFonts w:ascii="Arial" w:hAnsi="Arial" w:cs="Arial"/>
+          <w:szCs w:val="24"/>
+        </w:rPr>
+        <w:t xml:space="preserve">Multi-ancestry study of blood lipid levels identifies four loci interacting with physical activity. </w:t>
       </w:r>
       <w:r>
         <w:rPr>
@@ -3655,21 +3524,12 @@
         </w:rPr>
         <w:t xml:space="preserve">de Vries PS, et al. </w:t>
       </w:r>
-      <w:proofErr w:type="gramStart"/>
-      <w:r>
-        <w:rPr>
-          <w:rFonts w:ascii="Arial" w:hAnsi="Arial" w:cs="Arial"/>
-          <w:szCs w:val="24"/>
-        </w:rPr>
-        <w:t>Multi-ancestry</w:t>
-      </w:r>
-      <w:proofErr w:type="gramEnd"/>
-      <w:r>
-        <w:rPr>
-          <w:rFonts w:ascii="Arial" w:hAnsi="Arial" w:cs="Arial"/>
-          <w:szCs w:val="24"/>
-        </w:rPr>
-        <w:t xml:space="preserve"> genome-wide association study of lipid levels incorporating gene-alcohol interactions</w:t>
+      <w:r>
+        <w:rPr>
+          <w:rFonts w:ascii="Arial" w:hAnsi="Arial" w:cs="Arial"/>
+          <w:szCs w:val="24"/>
+        </w:rPr>
+        <w:t>Multi-ancestry genome-wide association study of lipid levels incorporating gene-alcohol interactions</w:t>
       </w:r>
       <w:r>
         <w:rPr>
@@ -3865,6 +3725,7 @@
           <w:szCs w:val="24"/>
           <w:lang w:eastAsia="zh-CN"/>
         </w:rPr>
+        <w:lastRenderedPageBreak/>
         <w:t xml:space="preserve">Zhao J, et al. </w:t>
       </w:r>
       <w:r>
@@ -3947,7 +3808,6 @@
           <w:rFonts w:ascii="Arial" w:hAnsi="Arial" w:cs="Arial"/>
           <w:szCs w:val="24"/>
         </w:rPr>
-        <w:lastRenderedPageBreak/>
         <w:t xml:space="preserve">Sung YJ, et al. A multi-ancestry genome-wide study </w:t>
       </w:r>
       <w:proofErr w:type="spellStart"/>
@@ -4165,23 +4025,7 @@
           <w:rFonts w:ascii="Arial" w:hAnsi="Arial" w:cs="Arial"/>
           <w:szCs w:val="24"/>
         </w:rPr>
-        <w:t xml:space="preserve"> </w:t>
-      </w:r>
-      <w:proofErr w:type="gramStart"/>
-      <w:r>
-        <w:rPr>
-          <w:rFonts w:ascii="Arial" w:hAnsi="Arial" w:cs="Arial"/>
-          <w:szCs w:val="24"/>
-        </w:rPr>
-        <w:t>Multi-ancestry</w:t>
-      </w:r>
-      <w:proofErr w:type="gramEnd"/>
-      <w:r>
-        <w:rPr>
-          <w:rFonts w:ascii="Arial" w:hAnsi="Arial" w:cs="Arial"/>
-          <w:szCs w:val="24"/>
-        </w:rPr>
-        <w:t xml:space="preserve"> genome-wide gene–smoking interaction study of 387,272 individuals identifies new loci associated with serum lipids. </w:t>
+        <w:t xml:space="preserve"> Multi-ancestry genome-wide gene–smoking interaction study of 387,272 individuals identifies new loci associated with serum lipids. </w:t>
       </w:r>
       <w:r>
         <w:rPr>
@@ -5398,21 +5242,12 @@
         </w:rPr>
         <w:t xml:space="preserve">Shrine N, et al. </w:t>
       </w:r>
-      <w:proofErr w:type="gramStart"/>
-      <w:r>
-        <w:rPr>
-          <w:rFonts w:ascii="Arial" w:hAnsi="Arial" w:cs="Arial"/>
-          <w:szCs w:val="24"/>
-        </w:rPr>
-        <w:t>Multi-ancestry</w:t>
-      </w:r>
-      <w:proofErr w:type="gramEnd"/>
-      <w:r>
-        <w:rPr>
-          <w:rFonts w:ascii="Arial" w:hAnsi="Arial" w:cs="Arial"/>
-          <w:szCs w:val="24"/>
-        </w:rPr>
-        <w:t xml:space="preserve"> genome-wide association study improves resolution of genes, pathways and pleiotropy for lung function and chronic obstructive pulmonary disease. </w:t>
+      <w:r>
+        <w:rPr>
+          <w:rFonts w:ascii="Arial" w:hAnsi="Arial" w:cs="Arial"/>
+          <w:szCs w:val="24"/>
+        </w:rPr>
+        <w:t xml:space="preserve">Multi-ancestry genome-wide association study improves resolution of genes, pathways and pleiotropy for lung function and chronic obstructive pulmonary disease. </w:t>
       </w:r>
       <w:r>
         <w:rPr>
@@ -5482,6 +5317,7 @@
           <w:rFonts w:ascii="Arial" w:hAnsi="Arial" w:cs="Arial"/>
           <w:szCs w:val="24"/>
         </w:rPr>
+        <w:lastRenderedPageBreak/>
         <w:t xml:space="preserve">van de Vegte JY, et al. Genetic insights into resting heart rate and its role in cardiovascular disease. </w:t>
       </w:r>
       <w:r>
@@ -5562,7 +5398,6 @@
           <w:b/>
           <w:bCs/>
         </w:rPr>
-        <w:lastRenderedPageBreak/>
         <w:t>Zhao JH</w:t>
       </w:r>
       <w:r>
@@ -5812,7 +5647,6 @@
         </w:rPr>
         <w:t xml:space="preserve"> </w:t>
       </w:r>
-      <w:proofErr w:type="gramStart"/>
       <w:r>
         <w:rPr>
           <w:rFonts w:ascii="Arial" w:hAnsi="Arial" w:cs="Arial"/>
@@ -5839,16 +5673,7 @@
           <w:szCs w:val="24"/>
           <w:lang w:eastAsia="zh-CN"/>
         </w:rPr>
-        <w:t>E</w:t>
-      </w:r>
-      <w:proofErr w:type="gramEnd"/>
-      <w:r>
-        <w:rPr>
-          <w:rFonts w:ascii="Arial" w:hAnsi="Arial" w:cs="Arial"/>
-          <w:szCs w:val="24"/>
-          <w:lang w:eastAsia="zh-CN"/>
-        </w:rPr>
-        <w:t>7–E26 (2023).</w:t>
+        <w:t>E7–E26 (2023).</w:t>
       </w:r>
     </w:p>
     <w:p>
@@ -6343,23 +6168,13 @@
         </w:rPr>
         <w:t xml:space="preserve"> M, et al. </w:t>
       </w:r>
-      <w:proofErr w:type="gramStart"/>
       <w:r>
         <w:rPr>
           <w:rFonts w:ascii="Arial" w:hAnsi="Arial" w:cs="Arial"/>
           <w:szCs w:val="24"/>
           <w:lang w:val="en-GB"/>
         </w:rPr>
-        <w:t>Multi-cohort</w:t>
-      </w:r>
-      <w:proofErr w:type="gramEnd"/>
-      <w:r>
-        <w:rPr>
-          <w:rFonts w:ascii="Arial" w:hAnsi="Arial" w:cs="Arial"/>
-          <w:szCs w:val="24"/>
-          <w:lang w:val="en-GB"/>
-        </w:rPr>
-        <w:t xml:space="preserve"> proteogenomic analyses reveal genetic effects across the proteome and </w:t>
+        <w:t xml:space="preserve">Multi-cohort proteogenomic analyses reveal genetic effects across the proteome and </w:t>
       </w:r>
       <w:proofErr w:type="spellStart"/>
       <w:r>
@@ -6575,34 +6390,7 @@
           <w:szCs w:val="24"/>
           <w:lang w:val="en-GB" w:eastAsia="zh-CN"/>
         </w:rPr>
-        <w:t>Genetic architecture of body composition reveals six biologically</w:t>
-      </w:r>
-      <w:r>
-        <w:rPr>
-          <w:rFonts w:ascii="Arial" w:eastAsia="Times New Roman" w:hAnsi="Arial" w:cs="Arial"/>
-          <w:color w:val="000000"/>
-          <w:szCs w:val="24"/>
-          <w:lang w:val="en-GB" w:eastAsia="zh-CN"/>
-        </w:rPr>
-        <w:t xml:space="preserve"> </w:t>
-      </w:r>
-      <w:r>
-        <w:rPr>
-          <w:rFonts w:ascii="Arial" w:eastAsia="Times New Roman" w:hAnsi="Arial" w:cs="Arial"/>
-          <w:color w:val="000000"/>
-          <w:szCs w:val="24"/>
-          <w:lang w:val="en-GB" w:eastAsia="zh-CN"/>
-        </w:rPr>
-        <w:t>distinct body types and therapeutic opportunities</w:t>
-      </w:r>
-      <w:r>
-        <w:rPr>
-          <w:rFonts w:ascii="Arial" w:eastAsia="Times New Roman" w:hAnsi="Arial" w:cs="Arial"/>
-          <w:color w:val="000000"/>
-          <w:szCs w:val="24"/>
-          <w:lang w:val="en-GB" w:eastAsia="zh-CN"/>
-        </w:rPr>
-        <w:t>.</w:t>
+        <w:t>Genetic architecture of body composition reveals six biologically distinct body types and therapeutic opportunities.</w:t>
       </w:r>
     </w:p>
     <w:sectPr>
@@ -8841,6 +8629,7 @@
   <w:style w:type="character" w:default="1" w:styleId="DefaultParagraphFont">
     <w:name w:val="Default Paragraph Font"/>
     <w:uiPriority w:val="1"/>
+    <w:semiHidden/>
     <w:unhideWhenUsed/>
   </w:style>
   <w:style w:type="table" w:default="1" w:styleId="TableNormal">

</xml_diff>

<commit_message>
Deploy site 2026-10-21 21:32:49
</commit_message>
<xml_diff>
--- a/cv.docx
+++ b/cv.docx
@@ -6407,35 +6407,7 @@
           <w:rFonts w:ascii="Arial" w:hAnsi="Arial" w:cs="Arial"/>
           <w:szCs w:val="24"/>
         </w:rPr>
-        <w:t>Needham</w:t>
-      </w:r>
-      <w:r>
-        <w:rPr>
-          <w:rFonts w:ascii="Arial" w:hAnsi="Arial" w:cs="Arial"/>
-          <w:szCs w:val="24"/>
-        </w:rPr>
-        <w:t xml:space="preserve"> EJ</w:t>
-      </w:r>
-      <w:r>
-        <w:rPr>
-          <w:rFonts w:ascii="Arial" w:hAnsi="Arial" w:cs="Arial"/>
-          <w:szCs w:val="24"/>
-        </w:rPr>
-        <w:t>, Zhao</w:t>
-      </w:r>
-      <w:r>
-        <w:rPr>
-          <w:rFonts w:ascii="Arial" w:hAnsi="Arial" w:cs="Arial"/>
-          <w:szCs w:val="24"/>
-        </w:rPr>
-        <w:t xml:space="preserve"> JH</w:t>
-      </w:r>
-      <w:r>
-        <w:rPr>
-          <w:rFonts w:ascii="Arial" w:hAnsi="Arial" w:cs="Arial"/>
-          <w:szCs w:val="24"/>
-        </w:rPr>
-        <w:t xml:space="preserve">, </w:t>
+        <w:t xml:space="preserve">Needham EJ, Zhao JH, </w:t>
       </w:r>
       <w:proofErr w:type="spellStart"/>
       <w:r>
@@ -6451,42 +6423,14 @@
           <w:rFonts w:ascii="Arial" w:hAnsi="Arial" w:cs="Arial"/>
           <w:szCs w:val="24"/>
         </w:rPr>
-        <w:t xml:space="preserve"> N</w:t>
-      </w:r>
-      <w:r>
-        <w:rPr>
-          <w:rFonts w:ascii="Arial" w:hAnsi="Arial" w:cs="Arial"/>
-          <w:szCs w:val="24"/>
-        </w:rPr>
-        <w:t>, Wolford</w:t>
-      </w:r>
-      <w:r>
-        <w:rPr>
-          <w:rFonts w:ascii="Arial" w:hAnsi="Arial" w:cs="Arial"/>
-          <w:szCs w:val="24"/>
-        </w:rPr>
-        <w:t xml:space="preserve"> C</w:t>
-      </w:r>
-      <w:r>
-        <w:rPr>
-          <w:rFonts w:ascii="Arial" w:hAnsi="Arial" w:cs="Arial"/>
-          <w:szCs w:val="24"/>
-        </w:rPr>
-        <w:t>, Jiang</w:t>
-      </w:r>
-      <w:r>
-        <w:rPr>
-          <w:rFonts w:ascii="Arial" w:hAnsi="Arial" w:cs="Arial"/>
-          <w:szCs w:val="24"/>
-        </w:rPr>
-        <w:t xml:space="preserve"> X</w:t>
-      </w:r>
-      <w:r>
-        <w:rPr>
-          <w:rFonts w:ascii="Arial" w:hAnsi="Arial" w:cs="Arial"/>
-          <w:szCs w:val="24"/>
-        </w:rPr>
-        <w:t>,</w:t>
+        <w:t xml:space="preserve"> N, Wolford C, Jiang X, Butterworth AS. Genetic determinants of protein phosphorylation in humans</w:t>
+      </w:r>
+      <w:r>
+        <w:rPr>
+          <w:rFonts w:ascii="Arial" w:hAnsi="Arial" w:cs="Arial"/>
+          <w:szCs w:val="24"/>
+        </w:rPr>
+        <w:t>.</w:t>
       </w:r>
       <w:r>
         <w:rPr>
@@ -6495,26 +6439,21 @@
         </w:rPr>
         <w:t xml:space="preserve"> </w:t>
       </w:r>
-      <w:r>
-        <w:rPr>
-          <w:rFonts w:ascii="Arial" w:hAnsi="Arial" w:cs="Arial"/>
-          <w:szCs w:val="24"/>
-        </w:rPr>
-        <w:t>Butterworth</w:t>
-      </w:r>
-      <w:r>
-        <w:rPr>
-          <w:rFonts w:ascii="Arial" w:hAnsi="Arial" w:cs="Arial"/>
-          <w:szCs w:val="24"/>
-        </w:rPr>
-        <w:t xml:space="preserve"> AS. </w:t>
-      </w:r>
-      <w:r>
-        <w:rPr>
-          <w:rFonts w:ascii="Arial" w:hAnsi="Arial" w:cs="Arial"/>
-          <w:szCs w:val="24"/>
-        </w:rPr>
-        <w:t>Genetic determinants of protein phosphorylation in humans</w:t>
+      <w:proofErr w:type="spellStart"/>
+      <w:r>
+        <w:rPr>
+          <w:rFonts w:ascii="Arial" w:hAnsi="Arial" w:cs="Arial"/>
+          <w:szCs w:val="24"/>
+        </w:rPr>
+        <w:t>doi</w:t>
+      </w:r>
+      <w:proofErr w:type="spellEnd"/>
+      <w:r>
+        <w:rPr>
+          <w:rFonts w:ascii="Arial" w:hAnsi="Arial" w:cs="Arial"/>
+          <w:szCs w:val="24"/>
+        </w:rPr>
+        <w:t>: 10.64898/2026.10.17.26365814</w:t>
       </w:r>
       <w:r>
         <w:rPr>
@@ -8760,7 +8699,6 @@
   <w:style w:type="character" w:default="1" w:styleId="DefaultParagraphFont">
     <w:name w:val="Default Paragraph Font"/>
     <w:uiPriority w:val="1"/>
-    <w:semiHidden/>
     <w:unhideWhenUsed/>
   </w:style>
   <w:style w:type="table" w:default="1" w:styleId="TableNormal">

</xml_diff>

<commit_message>
Deploy site 2026-10-21 21:53:54
</commit_message>
<xml_diff>
--- a/cv.docx
+++ b/cv.docx
@@ -629,21 +629,12 @@
         </w:rPr>
         <w:t xml:space="preserve"> and </w:t>
       </w:r>
-      <w:proofErr w:type="spellStart"/>
-      <w:r>
-        <w:rPr>
-          <w:rFonts w:ascii="Arial" w:hAnsi="Arial" w:cs="Arial"/>
-          <w:szCs w:val="24"/>
-        </w:rPr>
-        <w:t>genomewide</w:t>
-      </w:r>
-      <w:proofErr w:type="spellEnd"/>
-      <w:r>
-        <w:rPr>
-          <w:rFonts w:ascii="Arial" w:hAnsi="Arial" w:cs="Arial"/>
-          <w:szCs w:val="24"/>
-        </w:rPr>
-        <w:t xml:space="preserve"> association studies (GWASs</w:t>
+      <w:r>
+        <w:rPr>
+          <w:rFonts w:ascii="Arial" w:hAnsi="Arial" w:cs="Arial"/>
+          <w:szCs w:val="24"/>
+        </w:rPr>
+        <w:t>genomewide association studies (GWASs</w:t>
       </w:r>
       <w:r>
         <w:rPr>
@@ -692,47 +683,50 @@
           <w:rFonts w:ascii="Arial" w:hAnsi="Arial" w:cs="Arial"/>
           <w:szCs w:val="24"/>
         </w:rPr>
+        <w:t xml:space="preserve"> proteogenomics</w:t>
+      </w:r>
+      <w:r>
+        <w:rPr>
+          <w:rFonts w:ascii="Arial" w:hAnsi="Arial" w:cs="Arial"/>
+          <w:szCs w:val="24"/>
+        </w:rPr>
+        <w:t xml:space="preserve"> within the SCALLOP consortium </w:t>
+      </w:r>
+      <w:r>
+        <w:rPr>
+          <w:rFonts w:ascii="Arial" w:hAnsi="Arial" w:cs="Arial"/>
+          <w:szCs w:val="24"/>
+        </w:rPr>
+        <w:t xml:space="preserve">and other projects </w:t>
+      </w:r>
+      <w:r>
+        <w:rPr>
+          <w:rFonts w:ascii="Arial" w:hAnsi="Arial" w:cs="Arial"/>
+          <w:szCs w:val="24"/>
+        </w:rPr>
+        <w:t xml:space="preserve">using Olink </w:t>
+      </w:r>
+      <w:r>
+        <w:rPr>
+          <w:rFonts w:ascii="Arial" w:hAnsi="Arial" w:cs="Arial"/>
+          <w:szCs w:val="24"/>
+        </w:rPr>
+        <w:t>and</w:t>
+      </w:r>
+      <w:r>
+        <w:rPr>
+          <w:rFonts w:ascii="Arial" w:hAnsi="Arial" w:cs="Arial"/>
+          <w:szCs w:val="24"/>
+        </w:rPr>
         <w:t xml:space="preserve"> </w:t>
       </w:r>
-      <w:proofErr w:type="spellStart"/>
-      <w:r>
-        <w:rPr>
-          <w:rFonts w:ascii="Arial" w:hAnsi="Arial" w:cs="Arial"/>
-          <w:szCs w:val="24"/>
-        </w:rPr>
-        <w:t>proteogenomics</w:t>
-      </w:r>
-      <w:proofErr w:type="spellEnd"/>
-      <w:r>
-        <w:rPr>
-          <w:rFonts w:ascii="Arial" w:hAnsi="Arial" w:cs="Arial"/>
-          <w:szCs w:val="24"/>
-        </w:rPr>
-        <w:t xml:space="preserve"> within the SCALLOP consortium </w:t>
-      </w:r>
-      <w:r>
-        <w:rPr>
-          <w:rFonts w:ascii="Arial" w:hAnsi="Arial" w:cs="Arial"/>
-          <w:szCs w:val="24"/>
-        </w:rPr>
-        <w:t xml:space="preserve">and other projects </w:t>
-      </w:r>
-      <w:r>
-        <w:rPr>
-          <w:rFonts w:ascii="Arial" w:hAnsi="Arial" w:cs="Arial"/>
-          <w:szCs w:val="24"/>
-        </w:rPr>
-        <w:t xml:space="preserve">using </w:t>
-      </w:r>
-      <w:proofErr w:type="spellStart"/>
-      <w:r>
-        <w:rPr>
-          <w:rFonts w:ascii="Arial" w:hAnsi="Arial" w:cs="Arial"/>
-          <w:szCs w:val="24"/>
-        </w:rPr>
-        <w:t>Olink</w:t>
-      </w:r>
-      <w:proofErr w:type="spellEnd"/>
+      <w:r>
+        <w:rPr>
+          <w:rFonts w:ascii="Arial" w:hAnsi="Arial" w:cs="Arial"/>
+          <w:szCs w:val="24"/>
+        </w:rPr>
+        <w:t>mass spectrometry</w:t>
+      </w:r>
       <w:r>
         <w:rPr>
           <w:rFonts w:ascii="Arial" w:hAnsi="Arial" w:cs="Arial"/>
@@ -745,34 +739,6 @@
           <w:rFonts w:ascii="Arial" w:hAnsi="Arial" w:cs="Arial"/>
           <w:szCs w:val="24"/>
         </w:rPr>
-        <w:t>and</w:t>
-      </w:r>
-      <w:r>
-        <w:rPr>
-          <w:rFonts w:ascii="Arial" w:hAnsi="Arial" w:cs="Arial"/>
-          <w:szCs w:val="24"/>
-        </w:rPr>
-        <w:t xml:space="preserve"> </w:t>
-      </w:r>
-      <w:r>
-        <w:rPr>
-          <w:rFonts w:ascii="Arial" w:hAnsi="Arial" w:cs="Arial"/>
-          <w:szCs w:val="24"/>
-        </w:rPr>
-        <w:t>mass spectrometry</w:t>
-      </w:r>
-      <w:r>
-        <w:rPr>
-          <w:rFonts w:ascii="Arial" w:hAnsi="Arial" w:cs="Arial"/>
-          <w:szCs w:val="24"/>
-        </w:rPr>
-        <w:t xml:space="preserve"> </w:t>
-      </w:r>
-      <w:r>
-        <w:rPr>
-          <w:rFonts w:ascii="Arial" w:hAnsi="Arial" w:cs="Arial"/>
-          <w:szCs w:val="24"/>
-        </w:rPr>
         <w:t xml:space="preserve">(MS) </w:t>
       </w:r>
       <w:r>
@@ -801,17 +767,8 @@
           <w:rFonts w:ascii="Arial" w:hAnsi="Arial" w:cs="Arial"/>
           <w:szCs w:val="24"/>
         </w:rPr>
-        <w:t>the SCALLOP-Seq(</w:t>
-      </w:r>
-      <w:proofErr w:type="spellStart"/>
-      <w:r>
-        <w:rPr>
-          <w:rFonts w:ascii="Arial" w:hAnsi="Arial" w:cs="Arial"/>
-          <w:szCs w:val="24"/>
-        </w:rPr>
-        <w:t>uence</w:t>
-      </w:r>
-      <w:proofErr w:type="spellEnd"/>
+        <w:t>the SCALLOP-Seq(uence</w:t>
+      </w:r>
       <w:r>
         <w:rPr>
           <w:rFonts w:ascii="Arial" w:hAnsi="Arial" w:cs="Arial"/>
@@ -1052,15 +1009,20 @@
         </w:rPr>
         <w:t xml:space="preserve"> </w:t>
       </w:r>
-      <w:proofErr w:type="spellStart"/>
-      <w:r>
-        <w:rPr>
-          <w:rFonts w:ascii="Arial" w:hAnsi="Arial" w:cs="Arial"/>
-          <w:szCs w:val="24"/>
-        </w:rPr>
-        <w:t>Ollama</w:t>
-      </w:r>
-      <w:proofErr w:type="spellEnd"/>
+      <w:r>
+        <w:rPr>
+          <w:rFonts w:ascii="Arial" w:hAnsi="Arial" w:cs="Arial"/>
+          <w:szCs w:val="24"/>
+        </w:rPr>
+        <w:t xml:space="preserve">Ollama, </w:t>
+      </w:r>
+      <w:r>
+        <w:rPr>
+          <w:rFonts w:ascii="Arial" w:hAnsi="Arial" w:cs="Arial"/>
+          <w:szCs w:val="24"/>
+        </w:rPr>
+        <w:t>OpenClaw</w:t>
+      </w:r>
       <w:r>
         <w:rPr>
           <w:rFonts w:ascii="Arial" w:hAnsi="Arial" w:cs="Arial"/>
@@ -1073,53 +1035,21 @@
           <w:rFonts w:ascii="Arial" w:hAnsi="Arial" w:cs="Arial"/>
           <w:szCs w:val="24"/>
         </w:rPr>
-        <w:t>OpenClaw</w:t>
-      </w:r>
-      <w:r>
-        <w:rPr>
-          <w:rFonts w:ascii="Arial" w:hAnsi="Arial" w:cs="Arial"/>
-          <w:szCs w:val="24"/>
-        </w:rPr>
-        <w:t xml:space="preserve">, </w:t>
-      </w:r>
-      <w:r>
-        <w:rPr>
-          <w:rFonts w:ascii="Arial" w:hAnsi="Arial" w:cs="Arial"/>
-          <w:szCs w:val="24"/>
-        </w:rPr>
         <w:t xml:space="preserve">codex-cli, copilot-cli, </w:t>
       </w:r>
-      <w:proofErr w:type="spellStart"/>
-      <w:r>
-        <w:rPr>
-          <w:rFonts w:ascii="Arial" w:hAnsi="Arial" w:cs="Arial"/>
-          <w:szCs w:val="24"/>
-        </w:rPr>
-        <w:t>gemini</w:t>
-      </w:r>
-      <w:proofErr w:type="spellEnd"/>
-      <w:r>
-        <w:rPr>
-          <w:rFonts w:ascii="Arial" w:hAnsi="Arial" w:cs="Arial"/>
-          <w:szCs w:val="24"/>
-        </w:rPr>
-        <w:t xml:space="preserve">-cli, </w:t>
-      </w:r>
-      <w:proofErr w:type="spellStart"/>
-      <w:r>
-        <w:rPr>
-          <w:rFonts w:ascii="Arial" w:hAnsi="Arial" w:cs="Arial"/>
-          <w:szCs w:val="24"/>
-        </w:rPr>
-        <w:t>hermes</w:t>
-      </w:r>
-      <w:proofErr w:type="spellEnd"/>
-      <w:r>
-        <w:rPr>
-          <w:rFonts w:ascii="Arial" w:hAnsi="Arial" w:cs="Arial"/>
-          <w:szCs w:val="24"/>
-        </w:rPr>
-        <w:t xml:space="preserve">-agent, </w:t>
+      <w:r>
+        <w:rPr>
+          <w:rFonts w:ascii="Arial" w:hAnsi="Arial" w:cs="Arial"/>
+          <w:szCs w:val="24"/>
+        </w:rPr>
+        <w:t xml:space="preserve">gemini-cli, </w:t>
+      </w:r>
+      <w:r>
+        <w:rPr>
+          <w:rFonts w:ascii="Arial" w:hAnsi="Arial" w:cs="Arial"/>
+          <w:szCs w:val="24"/>
+        </w:rPr>
+        <w:t xml:space="preserve">hermes-agent, </w:t>
       </w:r>
       <w:r>
         <w:rPr>
@@ -1146,44 +1076,8 @@
         <w:rPr>
           <w:rFonts w:ascii="Arial" w:hAnsi="Arial" w:cs="Arial"/>
         </w:rPr>
-        <w:t xml:space="preserve">models, platforms and libraries such as TensorFlow, </w:t>
-      </w:r>
-      <w:proofErr w:type="spellStart"/>
-      <w:r>
-        <w:rPr>
-          <w:rFonts w:ascii="Arial" w:hAnsi="Arial" w:cs="Arial"/>
-        </w:rPr>
-        <w:t>PyTorch</w:t>
-      </w:r>
-      <w:proofErr w:type="spellEnd"/>
-      <w:r>
-        <w:rPr>
-          <w:rFonts w:ascii="Arial" w:hAnsi="Arial" w:cs="Arial"/>
-        </w:rPr>
-        <w:t>, scikit-</w:t>
-      </w:r>
-      <w:proofErr w:type="spellStart"/>
-      <w:r>
-        <w:rPr>
-          <w:rFonts w:ascii="Arial" w:hAnsi="Arial" w:cs="Arial"/>
-        </w:rPr>
-        <w:t>llm</w:t>
-      </w:r>
-      <w:proofErr w:type="spellEnd"/>
-      <w:r>
-        <w:rPr>
-          <w:rFonts w:ascii="Arial" w:hAnsi="Arial" w:cs="Arial"/>
-        </w:rPr>
-        <w:t xml:space="preserve">, </w:t>
-      </w:r>
-      <w:proofErr w:type="spellStart"/>
-      <w:r>
-        <w:rPr>
-          <w:rFonts w:ascii="Arial" w:hAnsi="Arial" w:cs="Arial"/>
-        </w:rPr>
-        <w:t>LangChain</w:t>
-      </w:r>
-      <w:proofErr w:type="spellEnd"/>
+        <w:t>models, platforms and libraries such as TensorFlow, PyTorch, scikit-llm, LangChain</w:t>
+      </w:r>
     </w:p>
     <w:p>
       <w:pPr>
@@ -1238,28 +1132,18 @@
         </w:rPr>
         <w:t xml:space="preserve"> </w:t>
       </w:r>
-      <w:proofErr w:type="spellStart"/>
-      <w:r>
-        <w:rPr>
-          <w:rFonts w:ascii="Arial" w:hAnsi="Arial" w:cs="Arial"/>
-        </w:rPr>
-        <w:t>FragPipe</w:t>
-      </w:r>
-      <w:proofErr w:type="spellEnd"/>
-      <w:r>
-        <w:rPr>
-          <w:rFonts w:ascii="Arial" w:hAnsi="Arial" w:cs="Arial"/>
-        </w:rPr>
-        <w:t xml:space="preserve">, </w:t>
-      </w:r>
-      <w:proofErr w:type="spellStart"/>
+      <w:r>
+        <w:rPr>
+          <w:rFonts w:ascii="Arial" w:hAnsi="Arial" w:cs="Arial"/>
+        </w:rPr>
+        <w:t xml:space="preserve">FragPipe, </w:t>
+      </w:r>
       <w:r>
         <w:rPr>
           <w:rFonts w:ascii="Arial" w:hAnsi="Arial" w:cs="Arial"/>
         </w:rPr>
         <w:t>InstaNovo</w:t>
       </w:r>
-      <w:proofErr w:type="spellEnd"/>
       <w:r>
         <w:rPr>
           <w:rFonts w:ascii="Arial" w:hAnsi="Arial" w:cs="Arial"/>
@@ -1276,16 +1160,8 @@
         <w:rPr>
           <w:rFonts w:ascii="Arial" w:hAnsi="Arial" w:cs="Arial"/>
         </w:rPr>
-        <w:t xml:space="preserve">, </w:t>
-      </w:r>
-      <w:proofErr w:type="spellStart"/>
-      <w:r>
-        <w:rPr>
-          <w:rFonts w:ascii="Arial" w:hAnsi="Arial" w:cs="Arial"/>
-        </w:rPr>
-        <w:t>OpenMS</w:t>
-      </w:r>
-      <w:proofErr w:type="spellEnd"/>
+        <w:t>, OpenMS</w:t>
+      </w:r>
     </w:p>
     <w:p>
       <w:pPr>
@@ -1325,56 +1201,24 @@
         </w:rPr>
         <w:t xml:space="preserve"> Seurat, </w:t>
       </w:r>
-      <w:proofErr w:type="spellStart"/>
-      <w:r>
-        <w:rPr>
-          <w:rFonts w:ascii="Arial" w:hAnsi="Arial" w:cs="Arial"/>
-        </w:rPr>
-        <w:t>scp</w:t>
-      </w:r>
-      <w:proofErr w:type="spellEnd"/>
-      <w:r>
-        <w:rPr>
-          <w:rFonts w:ascii="Arial" w:hAnsi="Arial" w:cs="Arial"/>
-        </w:rPr>
-        <w:t xml:space="preserve">, </w:t>
-      </w:r>
-      <w:proofErr w:type="spellStart"/>
-      <w:r>
-        <w:rPr>
-          <w:rFonts w:ascii="Arial" w:hAnsi="Arial" w:cs="Arial"/>
-        </w:rPr>
-        <w:t>scanpy</w:t>
-      </w:r>
-      <w:proofErr w:type="spellEnd"/>
-      <w:r>
-        <w:rPr>
-          <w:rFonts w:ascii="Arial" w:hAnsi="Arial" w:cs="Arial"/>
-        </w:rPr>
-        <w:t xml:space="preserve">, </w:t>
-      </w:r>
-      <w:proofErr w:type="spellStart"/>
-      <w:r>
-        <w:rPr>
-          <w:rFonts w:ascii="Arial" w:hAnsi="Arial" w:cs="Arial"/>
-        </w:rPr>
-        <w:t>scvi</w:t>
-      </w:r>
-      <w:proofErr w:type="spellEnd"/>
-      <w:r>
-        <w:rPr>
-          <w:rFonts w:ascii="Arial" w:hAnsi="Arial" w:cs="Arial"/>
-        </w:rPr>
-        <w:t xml:space="preserve">-tools, </w:t>
-      </w:r>
-      <w:proofErr w:type="spellStart"/>
+      <w:r>
+        <w:rPr>
+          <w:rFonts w:ascii="Arial" w:hAnsi="Arial" w:cs="Arial"/>
+        </w:rPr>
+        <w:t xml:space="preserve">scp, </w:t>
+      </w:r>
+      <w:r>
+        <w:rPr>
+          <w:rFonts w:ascii="Arial" w:hAnsi="Arial" w:cs="Arial"/>
+        </w:rPr>
+        <w:t xml:space="preserve">scanpy, scvi-tools, </w:t>
+      </w:r>
       <w:r>
         <w:rPr>
           <w:rFonts w:ascii="Arial" w:hAnsi="Arial" w:cs="Arial"/>
         </w:rPr>
         <w:t>scGPT</w:t>
       </w:r>
-      <w:proofErr w:type="spellEnd"/>
       <w:r>
         <w:rPr>
           <w:rFonts w:ascii="Arial" w:hAnsi="Arial" w:cs="Arial"/>
@@ -1424,49 +1268,55 @@
         <w:rPr>
           <w:rFonts w:ascii="Arial" w:hAnsi="Arial" w:cs="Arial"/>
         </w:rPr>
+        <w:t xml:space="preserve"> MToolBox</w:t>
+      </w:r>
+      <w:r>
+        <w:rPr>
+          <w:rFonts w:ascii="Arial" w:hAnsi="Arial" w:cs="Arial"/>
+        </w:rPr>
+        <w:t xml:space="preserve">, </w:t>
+      </w:r>
+      <w:r>
+        <w:rPr>
+          <w:rFonts w:ascii="Arial" w:hAnsi="Arial" w:cs="Arial"/>
+        </w:rPr>
+        <w:t xml:space="preserve">fNUMT, </w:t>
+      </w:r>
+      <w:r>
+        <w:rPr>
+          <w:rFonts w:ascii="Arial" w:hAnsi="Arial" w:cs="Arial"/>
+        </w:rPr>
+        <w:t>haplogrep</w:t>
+      </w:r>
+      <w:r>
+        <w:rPr>
+          <w:rFonts w:ascii="Arial" w:hAnsi="Arial" w:cs="Arial"/>
+        </w:rPr>
+        <w:t>;</w:t>
+      </w:r>
+      <w:r>
+        <w:rPr>
+          <w:rFonts w:ascii="Arial" w:hAnsi="Arial" w:cs="Arial"/>
+        </w:rPr>
         <w:t xml:space="preserve"> </w:t>
       </w:r>
-      <w:proofErr w:type="spellStart"/>
-      <w:r>
-        <w:rPr>
-          <w:rFonts w:ascii="Arial" w:hAnsi="Arial" w:cs="Arial"/>
-        </w:rPr>
-        <w:t>MToolBox</w:t>
-      </w:r>
-      <w:proofErr w:type="spellEnd"/>
-      <w:r>
-        <w:rPr>
-          <w:rFonts w:ascii="Arial" w:hAnsi="Arial" w:cs="Arial"/>
-        </w:rPr>
-        <w:t xml:space="preserve">, </w:t>
-      </w:r>
-      <w:proofErr w:type="spellStart"/>
-      <w:r>
-        <w:rPr>
-          <w:rFonts w:ascii="Arial" w:hAnsi="Arial" w:cs="Arial"/>
-        </w:rPr>
-        <w:t>fNUMT</w:t>
-      </w:r>
-      <w:proofErr w:type="spellEnd"/>
-      <w:r>
-        <w:rPr>
-          <w:rFonts w:ascii="Arial" w:hAnsi="Arial" w:cs="Arial"/>
-        </w:rPr>
-        <w:t xml:space="preserve">, </w:t>
-      </w:r>
-      <w:proofErr w:type="spellStart"/>
-      <w:r>
-        <w:rPr>
-          <w:rFonts w:ascii="Arial" w:hAnsi="Arial" w:cs="Arial"/>
-        </w:rPr>
-        <w:t>haplogrep</w:t>
-      </w:r>
-      <w:proofErr w:type="spellEnd"/>
-      <w:r>
-        <w:rPr>
-          <w:rFonts w:ascii="Arial" w:hAnsi="Arial" w:cs="Arial"/>
-        </w:rPr>
-        <w:t>;</w:t>
+      <w:r>
+        <w:rPr>
+          <w:rFonts w:ascii="Arial" w:hAnsi="Arial" w:cs="Arial"/>
+        </w:rPr>
+        <w:t xml:space="preserve">long-read sequencing </w:t>
+      </w:r>
+      <w:r>
+        <w:rPr>
+          <w:rFonts w:ascii="Arial" w:hAnsi="Arial" w:cs="Arial"/>
+        </w:rPr>
+        <w:t>analysis</w:t>
+      </w:r>
+      <w:r>
+        <w:rPr>
+          <w:rFonts w:ascii="Arial" w:hAnsi="Arial" w:cs="Arial"/>
+        </w:rPr>
+        <w:t>:</w:t>
       </w:r>
       <w:r>
         <w:rPr>
@@ -1478,39 +1328,7 @@
         <w:rPr>
           <w:rFonts w:ascii="Arial" w:hAnsi="Arial" w:cs="Arial"/>
         </w:rPr>
-        <w:t xml:space="preserve">long-read sequencing </w:t>
-      </w:r>
-      <w:r>
-        <w:rPr>
-          <w:rFonts w:ascii="Arial" w:hAnsi="Arial" w:cs="Arial"/>
-        </w:rPr>
-        <w:t>analysis</w:t>
-      </w:r>
-      <w:r>
-        <w:rPr>
-          <w:rFonts w:ascii="Arial" w:hAnsi="Arial" w:cs="Arial"/>
-        </w:rPr>
-        <w:t>:</w:t>
-      </w:r>
-      <w:r>
-        <w:rPr>
-          <w:rFonts w:ascii="Arial" w:hAnsi="Arial" w:cs="Arial"/>
-        </w:rPr>
-        <w:t xml:space="preserve"> </w:t>
-      </w:r>
-      <w:proofErr w:type="spellStart"/>
-      <w:r>
-        <w:rPr>
-          <w:rFonts w:ascii="Arial" w:hAnsi="Arial" w:cs="Arial"/>
-        </w:rPr>
-        <w:t>SVanalyzer</w:t>
-      </w:r>
-      <w:proofErr w:type="spellEnd"/>
-      <w:r>
-        <w:rPr>
-          <w:rFonts w:ascii="Arial" w:hAnsi="Arial" w:cs="Arial"/>
-        </w:rPr>
-        <w:t xml:space="preserve">, </w:t>
+        <w:t xml:space="preserve">SVanalyzer, </w:t>
       </w:r>
       <w:r>
         <w:rPr>
@@ -1522,16 +1340,8 @@
         <w:rPr>
           <w:rFonts w:ascii="Arial" w:hAnsi="Arial" w:cs="Arial"/>
         </w:rPr>
-        <w:t xml:space="preserve"> </w:t>
-      </w:r>
-      <w:proofErr w:type="spellStart"/>
-      <w:r>
-        <w:rPr>
-          <w:rFonts w:ascii="Arial" w:hAnsi="Arial" w:cs="Arial"/>
-        </w:rPr>
-        <w:t>truvari</w:t>
-      </w:r>
-      <w:proofErr w:type="spellEnd"/>
+        <w:t xml:space="preserve"> truvari</w:t>
+      </w:r>
     </w:p>
     <w:p>
       <w:pPr>
@@ -1569,35 +1379,7 @@
         <w:rPr>
           <w:rFonts w:ascii="Arial" w:hAnsi="Arial" w:cs="Arial"/>
         </w:rPr>
-        <w:t xml:space="preserve"> </w:t>
-      </w:r>
-      <w:proofErr w:type="spellStart"/>
-      <w:r>
-        <w:rPr>
-          <w:rFonts w:ascii="Arial" w:hAnsi="Arial" w:cs="Arial"/>
-        </w:rPr>
-        <w:t>selscan</w:t>
-      </w:r>
-      <w:proofErr w:type="spellEnd"/>
-      <w:r>
-        <w:rPr>
-          <w:rFonts w:ascii="Arial" w:hAnsi="Arial" w:cs="Arial"/>
-        </w:rPr>
-        <w:t xml:space="preserve">, </w:t>
-      </w:r>
-      <w:proofErr w:type="spellStart"/>
-      <w:r>
-        <w:rPr>
-          <w:rFonts w:ascii="Arial" w:hAnsi="Arial" w:cs="Arial"/>
-        </w:rPr>
-        <w:t>angsd</w:t>
-      </w:r>
-      <w:proofErr w:type="spellEnd"/>
-      <w:r>
-        <w:rPr>
-          <w:rFonts w:ascii="Arial" w:hAnsi="Arial" w:cs="Arial"/>
-        </w:rPr>
-        <w:t>, relate, clues2 and fastsimcoal2</w:t>
+        <w:t xml:space="preserve"> selscan, angsd, relate, clues2 and fastsimcoal2</w:t>
       </w:r>
     </w:p>
     <w:p>
@@ -1670,21 +1452,12 @@
           <w:lang w:val="fr-FR"/>
         </w:rPr>
       </w:pPr>
-      <w:proofErr w:type="spellStart"/>
-      <w:r>
-        <w:rPr>
-          <w:rFonts w:ascii="Arial" w:hAnsi="Arial" w:cs="Arial"/>
-          <w:szCs w:val="24"/>
-        </w:rPr>
-        <w:t>Koprulu</w:t>
-      </w:r>
-      <w:proofErr w:type="spellEnd"/>
-      <w:r>
-        <w:rPr>
-          <w:rFonts w:ascii="Arial" w:hAnsi="Arial" w:cs="Arial"/>
-          <w:szCs w:val="24"/>
-        </w:rPr>
-        <w:t xml:space="preserve"> M, et al. </w:t>
+      <w:r>
+        <w:rPr>
+          <w:rFonts w:ascii="Arial" w:hAnsi="Arial" w:cs="Arial"/>
+          <w:szCs w:val="24"/>
+        </w:rPr>
+        <w:t xml:space="preserve">Koprulu M, et al. </w:t>
       </w:r>
       <w:r>
         <w:rPr>
@@ -1692,18 +1465,8 @@
           <w:szCs w:val="24"/>
           <w:lang w:val="en-GB"/>
         </w:rPr>
-        <w:t xml:space="preserve">Multi-cohort proteogenomic analyses reveal genetic effects across the proteome and </w:t>
-      </w:r>
-      <w:proofErr w:type="spellStart"/>
-      <w:r>
-        <w:rPr>
-          <w:rFonts w:ascii="Arial" w:hAnsi="Arial" w:cs="Arial"/>
-          <w:szCs w:val="24"/>
-          <w:lang w:val="en-GB"/>
-        </w:rPr>
-        <w:t>diseasome</w:t>
-      </w:r>
-      <w:proofErr w:type="spellEnd"/>
+        <w:t>Multi-cohort proteogenomic analyses reveal genetic effects across the proteome and diseasome</w:t>
+      </w:r>
       <w:r>
         <w:rPr>
           <w:rFonts w:ascii="Arial" w:hAnsi="Arial" w:cs="Arial"/>
@@ -1767,21 +1530,7 @@
         <w:rPr>
           <w:rFonts w:ascii="Arial" w:hAnsi="Arial" w:cs="Arial"/>
         </w:rPr>
-        <w:t xml:space="preserve">, et al. Mapping </w:t>
-      </w:r>
-      <w:proofErr w:type="spellStart"/>
-      <w:r>
-        <w:rPr>
-          <w:rFonts w:ascii="Arial" w:hAnsi="Arial" w:cs="Arial"/>
-        </w:rPr>
-        <w:t>pQTLs</w:t>
-      </w:r>
-      <w:proofErr w:type="spellEnd"/>
-      <w:r>
-        <w:rPr>
-          <w:rFonts w:ascii="Arial" w:hAnsi="Arial" w:cs="Arial"/>
-        </w:rPr>
-        <w:t xml:space="preserve"> of circulating inflammatory proteins identifies drivers of immune-mediated disease risk and novel therapeutic targets. </w:t>
+        <w:t xml:space="preserve">, et al. Mapping pQTLs of circulating inflammatory proteins identifies drivers of immune-mediated disease risk and novel therapeutic targets. </w:t>
       </w:r>
       <w:r>
         <w:rPr>
@@ -1869,43 +1618,7 @@
           <w:szCs w:val="24"/>
           <w:lang w:val="fr-FR"/>
         </w:rPr>
-        <w:t xml:space="preserve">COVID-19 Host Genetics Initiative. Mapping the </w:t>
-      </w:r>
-      <w:proofErr w:type="spellStart"/>
-      <w:r>
-        <w:rPr>
-          <w:rFonts w:ascii="Arial" w:hAnsi="Arial" w:cs="Arial"/>
-          <w:szCs w:val="24"/>
-          <w:lang w:val="fr-FR"/>
-        </w:rPr>
-        <w:t>human</w:t>
-      </w:r>
-      <w:proofErr w:type="spellEnd"/>
-      <w:r>
-        <w:rPr>
-          <w:rFonts w:ascii="Arial" w:hAnsi="Arial" w:cs="Arial"/>
-          <w:szCs w:val="24"/>
-          <w:lang w:val="fr-FR"/>
-        </w:rPr>
-        <w:t xml:space="preserve"> </w:t>
-      </w:r>
-      <w:proofErr w:type="spellStart"/>
-      <w:r>
-        <w:rPr>
-          <w:rFonts w:ascii="Arial" w:hAnsi="Arial" w:cs="Arial"/>
-          <w:szCs w:val="24"/>
-          <w:lang w:val="fr-FR"/>
-        </w:rPr>
-        <w:t>genetic</w:t>
-      </w:r>
-      <w:proofErr w:type="spellEnd"/>
-      <w:r>
-        <w:rPr>
-          <w:rFonts w:ascii="Arial" w:hAnsi="Arial" w:cs="Arial"/>
-          <w:szCs w:val="24"/>
-          <w:lang w:val="fr-FR"/>
-        </w:rPr>
-        <w:t xml:space="preserve"> architecture of COVID-19. </w:t>
+        <w:t xml:space="preserve">COVID-19 Host Genetics Initiative. Mapping the human genetic architecture of COVID-19. </w:t>
       </w:r>
       <w:r>
         <w:rPr>
@@ -2169,7 +1882,6 @@
         </w:rPr>
         <w:t xml:space="preserve">. </w:t>
       </w:r>
-      <w:proofErr w:type="spellStart"/>
       <w:r>
         <w:rPr>
           <w:rFonts w:ascii="Arial" w:hAnsi="Arial" w:cs="Arial"/>
@@ -2177,17 +1889,7 @@
           <w:szCs w:val="24"/>
           <w:lang w:eastAsia="zh-CN"/>
         </w:rPr>
-        <w:t>doi</w:t>
-      </w:r>
-      <w:proofErr w:type="spellEnd"/>
-      <w:r>
-        <w:rPr>
-          <w:rFonts w:ascii="Arial" w:hAnsi="Arial" w:cs="Arial"/>
-          <w:iCs/>
-          <w:szCs w:val="24"/>
-          <w:lang w:eastAsia="zh-CN"/>
-        </w:rPr>
-        <w:t>: 10.18637/jss.v085.i06</w:t>
+        <w:t>doi: 10.18637/jss.v085.i06</w:t>
       </w:r>
       <w:r>
         <w:rPr>
@@ -2267,17 +1969,8 @@
           <w:rFonts w:ascii="Arial" w:hAnsi="Arial" w:cs="Arial"/>
           <w:szCs w:val="24"/>
         </w:rPr>
-        <w:t xml:space="preserve"> </w:t>
-      </w:r>
-      <w:proofErr w:type="spellStart"/>
-      <w:r>
-        <w:rPr>
-          <w:rFonts w:ascii="Arial" w:hAnsi="Arial" w:cs="Arial"/>
-          <w:szCs w:val="24"/>
-        </w:rPr>
-        <w:t>doi</w:t>
-      </w:r>
-      <w:proofErr w:type="spellEnd"/>
+        <w:t xml:space="preserve"> doi</w:t>
+      </w:r>
       <w:r>
         <w:rPr>
           <w:rFonts w:ascii="Arial" w:hAnsi="Arial" w:cs="Arial"/>
@@ -2331,23 +2024,13 @@
         </w:rPr>
         <w:t xml:space="preserve">. A latent variable partial least squares path modeling approach to regional association and polygenic effect with applications to a human obesity study. </w:t>
       </w:r>
-      <w:proofErr w:type="spellStart"/>
       <w:r>
         <w:rPr>
           <w:rFonts w:ascii="Arial" w:hAnsi="Arial" w:cs="Arial"/>
           <w:i/>
           <w:szCs w:val="24"/>
         </w:rPr>
-        <w:t>PLoS</w:t>
-      </w:r>
-      <w:proofErr w:type="spellEnd"/>
-      <w:r>
-        <w:rPr>
-          <w:rFonts w:ascii="Arial" w:hAnsi="Arial" w:cs="Arial"/>
-          <w:i/>
-          <w:szCs w:val="24"/>
-        </w:rPr>
-        <w:t xml:space="preserve"> ONE</w:t>
+        <w:t>PLoS ONE</w:t>
       </w:r>
       <w:r>
         <w:rPr>
@@ -2557,21 +2240,12 @@
         </w:rPr>
         <w:t xml:space="preserve"> </w:t>
       </w:r>
-      <w:proofErr w:type="spellStart"/>
-      <w:r>
-        <w:rPr>
-          <w:rFonts w:ascii="Arial" w:hAnsi="Arial" w:cs="Arial"/>
-          <w:szCs w:val="24"/>
-        </w:rPr>
-        <w:t>doi</w:t>
-      </w:r>
-      <w:proofErr w:type="spellEnd"/>
-      <w:r>
-        <w:rPr>
-          <w:rFonts w:ascii="Arial" w:hAnsi="Arial" w:cs="Arial"/>
-          <w:szCs w:val="24"/>
-        </w:rPr>
-        <w:t xml:space="preserve">: </w:t>
+      <w:r>
+        <w:rPr>
+          <w:rFonts w:ascii="Arial" w:hAnsi="Arial" w:cs="Arial"/>
+          <w:szCs w:val="24"/>
+        </w:rPr>
+        <w:t xml:space="preserve">doi: </w:t>
       </w:r>
       <w:r>
         <w:rPr>
@@ -2633,23 +2307,13 @@
           <w:lang w:eastAsia="zh-CN"/>
         </w:rPr>
       </w:pPr>
-      <w:proofErr w:type="spellStart"/>
       <w:r>
         <w:rPr>
           <w:rFonts w:ascii="Arial" w:eastAsia="TimesNewRomanPSMT" w:hAnsi="Arial" w:cs="Arial"/>
           <w:szCs w:val="24"/>
           <w:lang w:eastAsia="zh-CN"/>
         </w:rPr>
-        <w:t>Demenais</w:t>
-      </w:r>
-      <w:proofErr w:type="spellEnd"/>
-      <w:r>
-        <w:rPr>
-          <w:rFonts w:ascii="Arial" w:eastAsia="TimesNewRomanPSMT" w:hAnsi="Arial" w:cs="Arial"/>
-          <w:szCs w:val="24"/>
-          <w:lang w:eastAsia="zh-CN"/>
-        </w:rPr>
-        <w:t xml:space="preserve"> F, et al. </w:t>
+        <w:t xml:space="preserve">Demenais F, et al. </w:t>
       </w:r>
       <w:r>
         <w:rPr>
@@ -2993,23 +2657,13 @@
         </w:rPr>
         <w:t xml:space="preserve">Feitosa MF, et al. Novel genetic associations for blood pressure identified via gene-alcohol interaction in up to 570K individuals across multiple ancestries. </w:t>
       </w:r>
-      <w:proofErr w:type="spellStart"/>
       <w:r>
         <w:rPr>
           <w:rFonts w:ascii="Arial" w:hAnsi="Arial" w:cs="Arial"/>
           <w:i/>
           <w:szCs w:val="24"/>
         </w:rPr>
-        <w:t>PLoS</w:t>
-      </w:r>
-      <w:proofErr w:type="spellEnd"/>
-      <w:r>
-        <w:rPr>
-          <w:rFonts w:ascii="Arial" w:hAnsi="Arial" w:cs="Arial"/>
-          <w:i/>
-          <w:szCs w:val="24"/>
-        </w:rPr>
-        <w:t xml:space="preserve"> One</w:t>
+        <w:t>PLoS One</w:t>
       </w:r>
       <w:r>
         <w:rPr>
@@ -3256,18 +2910,8 @@
           <w:i/>
           <w:szCs w:val="24"/>
         </w:rPr>
-        <w:t xml:space="preserve">Mol </w:t>
-      </w:r>
-      <w:proofErr w:type="spellStart"/>
-      <w:r>
-        <w:rPr>
-          <w:rFonts w:ascii="Arial" w:hAnsi="Arial" w:cs="Arial"/>
-          <w:i/>
-          <w:szCs w:val="24"/>
-        </w:rPr>
-        <w:t>Psychiatr</w:t>
-      </w:r>
-      <w:proofErr w:type="spellEnd"/>
+        <w:t>Mol Psychiatr</w:t>
+      </w:r>
       <w:r>
         <w:rPr>
           <w:rFonts w:ascii="Arial" w:hAnsi="Arial" w:cs="Arial"/>
@@ -3433,21 +3077,8 @@
           <w:szCs w:val="24"/>
           <w:lang w:eastAsia="zh-CN"/>
         </w:rPr>
-        <w:t xml:space="preserve">Am J Clin </w:t>
-      </w:r>
-      <w:proofErr w:type="spellStart"/>
-      <w:r>
-        <w:rPr>
-          <w:rFonts w:ascii="Arial" w:hAnsi="Arial" w:cs="Arial"/>
-          <w:bCs/>
-          <w:i/>
-          <w:color w:val="000000"/>
-          <w:szCs w:val="24"/>
-          <w:lang w:eastAsia="zh-CN"/>
-        </w:rPr>
-        <w:t>Nutr</w:t>
-      </w:r>
-      <w:proofErr w:type="spellEnd"/>
+        <w:t>Am J Clin Nutr</w:t>
+      </w:r>
       <w:r>
         <w:rPr>
           <w:rFonts w:ascii="Arial" w:hAnsi="Arial" w:cs="Arial"/>
@@ -3470,23 +3101,7 @@
           <w:rFonts w:ascii="Arial" w:hAnsi="Arial" w:cs="Arial"/>
           <w:szCs w:val="24"/>
         </w:rPr>
-        <w:t>10.1093/</w:t>
-      </w:r>
-      <w:proofErr w:type="spellStart"/>
-      <w:r>
-        <w:rPr>
-          <w:rFonts w:ascii="Arial" w:hAnsi="Arial" w:cs="Arial"/>
-          <w:szCs w:val="24"/>
-        </w:rPr>
-        <w:t>ajcn</w:t>
-      </w:r>
-      <w:proofErr w:type="spellEnd"/>
-      <w:r>
-        <w:rPr>
-          <w:rFonts w:ascii="Arial" w:hAnsi="Arial" w:cs="Arial"/>
-          <w:szCs w:val="24"/>
-        </w:rPr>
-        <w:t>/nqy272</w:t>
+        <w:t>10.1093/ajcn/nqy272</w:t>
       </w:r>
       <w:r>
         <w:rPr>
@@ -3568,23 +3183,7 @@
           <w:rFonts w:ascii="Arial" w:hAnsi="Arial" w:cs="Arial"/>
           <w:szCs w:val="24"/>
         </w:rPr>
-        <w:t>10.1093/</w:t>
-      </w:r>
-      <w:proofErr w:type="spellStart"/>
-      <w:r>
-        <w:rPr>
-          <w:rFonts w:ascii="Arial" w:hAnsi="Arial" w:cs="Arial"/>
-          <w:szCs w:val="24"/>
-        </w:rPr>
-        <w:t>aje</w:t>
-      </w:r>
-      <w:proofErr w:type="spellEnd"/>
-      <w:r>
-        <w:rPr>
-          <w:rFonts w:ascii="Arial" w:hAnsi="Arial" w:cs="Arial"/>
-          <w:szCs w:val="24"/>
-        </w:rPr>
-        <w:t>/kwz005.</w:t>
+        <w:t>10.1093/aje/kwz005.</w:t>
       </w:r>
     </w:p>
     <w:p>
@@ -3805,39 +3404,7 @@
           <w:szCs w:val="24"/>
         </w:rPr>
         <w:lastRenderedPageBreak/>
-        <w:t xml:space="preserve">Sung YJ, et al. A multi-ancestry genome-wide study </w:t>
-      </w:r>
-      <w:proofErr w:type="spellStart"/>
-      <w:r>
-        <w:rPr>
-          <w:rFonts w:ascii="Arial" w:hAnsi="Arial" w:cs="Arial"/>
-          <w:szCs w:val="24"/>
-        </w:rPr>
-        <w:t>incorporatinggene</w:t>
-      </w:r>
-      <w:proofErr w:type="spellEnd"/>
-      <w:r>
-        <w:rPr>
-          <w:rFonts w:ascii="Arial" w:hAnsi="Arial" w:cs="Arial"/>
-          <w:szCs w:val="24"/>
-        </w:rPr>
-        <w:t xml:space="preserve">–smoking interactions identifies multiple new </w:t>
-      </w:r>
-      <w:proofErr w:type="spellStart"/>
-      <w:r>
-        <w:rPr>
-          <w:rFonts w:ascii="Arial" w:hAnsi="Arial" w:cs="Arial"/>
-          <w:szCs w:val="24"/>
-        </w:rPr>
-        <w:t>locifor</w:t>
-      </w:r>
-      <w:proofErr w:type="spellEnd"/>
-      <w:r>
-        <w:rPr>
-          <w:rFonts w:ascii="Arial" w:hAnsi="Arial" w:cs="Arial"/>
-          <w:szCs w:val="24"/>
-        </w:rPr>
-        <w:t xml:space="preserve"> pulse pressure and mean arterial pressure. </w:t>
+        <w:t xml:space="preserve">Sung YJ, et al. A multi-ancestry genome-wide study incorporatinggene–smoking interactions identifies multiple new locifor pulse pressure and mean arterial pressure. </w:t>
       </w:r>
       <w:r>
         <w:rPr>
@@ -3852,39 +3419,7 @@
           <w:rFonts w:ascii="Arial" w:hAnsi="Arial" w:cs="Arial"/>
           <w:szCs w:val="24"/>
         </w:rPr>
-        <w:t xml:space="preserve">2019, </w:t>
-      </w:r>
-      <w:proofErr w:type="spellStart"/>
-      <w:r>
-        <w:rPr>
-          <w:rFonts w:ascii="Arial" w:hAnsi="Arial" w:cs="Arial"/>
-          <w:szCs w:val="24"/>
-        </w:rPr>
-        <w:t>doi</w:t>
-      </w:r>
-      <w:proofErr w:type="spellEnd"/>
-      <w:r>
-        <w:rPr>
-          <w:rFonts w:ascii="Arial" w:hAnsi="Arial" w:cs="Arial"/>
-          <w:szCs w:val="24"/>
-        </w:rPr>
-        <w:t>: 10.1093/</w:t>
-      </w:r>
-      <w:proofErr w:type="spellStart"/>
-      <w:r>
-        <w:rPr>
-          <w:rFonts w:ascii="Arial" w:hAnsi="Arial" w:cs="Arial"/>
-          <w:szCs w:val="24"/>
-        </w:rPr>
-        <w:t>hmg</w:t>
-      </w:r>
-      <w:proofErr w:type="spellEnd"/>
-      <w:r>
-        <w:rPr>
-          <w:rFonts w:ascii="Arial" w:hAnsi="Arial" w:cs="Arial"/>
-          <w:szCs w:val="24"/>
-        </w:rPr>
-        <w:t>/ddz070</w:t>
+        <w:t>2019, doi: 10.1093/hmg/ddz070</w:t>
       </w:r>
       <w:r>
         <w:rPr>
@@ -3925,23 +3460,7 @@
           <w:rFonts w:ascii="Arial" w:hAnsi="Arial" w:cs="Arial"/>
           <w:szCs w:val="24"/>
         </w:rPr>
-        <w:t xml:space="preserve">Associations of </w:t>
-      </w:r>
-      <w:proofErr w:type="spellStart"/>
-      <w:r>
-        <w:rPr>
-          <w:rFonts w:ascii="Arial" w:hAnsi="Arial" w:cs="Arial"/>
-          <w:szCs w:val="24"/>
-        </w:rPr>
-        <w:t>autozygosity</w:t>
-      </w:r>
-      <w:proofErr w:type="spellEnd"/>
-      <w:r>
-        <w:rPr>
-          <w:rFonts w:ascii="Arial" w:hAnsi="Arial" w:cs="Arial"/>
-          <w:szCs w:val="24"/>
-        </w:rPr>
-        <w:t xml:space="preserve"> with a broad range of human phenotypes</w:t>
+        <w:t>Associations of autozygosity with a broad range of human phenotypes</w:t>
       </w:r>
       <w:r>
         <w:rPr>
@@ -4096,25 +3615,7 @@
           <w:szCs w:val="24"/>
           <w:lang w:eastAsia="zh-CN"/>
         </w:rPr>
-        <w:t xml:space="preserve">Shah S, et al. Genome-wide association and Mendelian </w:t>
-      </w:r>
-      <w:proofErr w:type="spellStart"/>
-      <w:r>
-        <w:rPr>
-          <w:rFonts w:ascii="Arial" w:eastAsia="Times New Roman" w:hAnsi="Arial" w:cs="Arial"/>
-          <w:szCs w:val="24"/>
-          <w:lang w:eastAsia="zh-CN"/>
-        </w:rPr>
-        <w:t>randomisation</w:t>
-      </w:r>
-      <w:proofErr w:type="spellEnd"/>
-      <w:r>
-        <w:rPr>
-          <w:rFonts w:ascii="Arial" w:eastAsia="Times New Roman" w:hAnsi="Arial" w:cs="Arial"/>
-          <w:szCs w:val="24"/>
-          <w:lang w:eastAsia="zh-CN"/>
-        </w:rPr>
-        <w:t xml:space="preserve"> analysis provide insights into the pathogenesis of heart failure. </w:t>
+        <w:t xml:space="preserve">Shah S, et al. Genome-wide association and Mendelian randomisation analysis provide insights into the pathogenesis of heart failure. </w:t>
       </w:r>
       <w:r>
         <w:rPr>
@@ -4334,27 +3835,7 @@
           <w:szCs w:val="24"/>
           <w:lang w:eastAsia="zh-CN"/>
         </w:rPr>
-        <w:t>Cuellar-</w:t>
-      </w:r>
-      <w:proofErr w:type="spellStart"/>
-      <w:r>
-        <w:rPr>
-          <w:rFonts w:ascii="Arial" w:hAnsi="Arial" w:cs="Arial"/>
-          <w:color w:val="000000"/>
-          <w:szCs w:val="24"/>
-          <w:lang w:eastAsia="zh-CN"/>
-        </w:rPr>
-        <w:t>Partide</w:t>
-      </w:r>
-      <w:proofErr w:type="spellEnd"/>
-      <w:r>
-        <w:rPr>
-          <w:rFonts w:ascii="Arial" w:hAnsi="Arial" w:cs="Arial"/>
-          <w:color w:val="000000"/>
-          <w:szCs w:val="24"/>
-          <w:lang w:eastAsia="zh-CN"/>
-        </w:rPr>
-        <w:t xml:space="preserve"> G, et al. </w:t>
+        <w:t xml:space="preserve">Cuellar-Partide G, et al. </w:t>
       </w:r>
       <w:r>
         <w:rPr>
@@ -4371,27 +3852,7 @@
           <w:b w:val="0"/>
           <w:i/>
         </w:rPr>
-        <w:t xml:space="preserve">Nat Hum </w:t>
-      </w:r>
-      <w:proofErr w:type="spellStart"/>
-      <w:r>
-        <w:rPr>
-          <w:rStyle w:val="fontstyle01"/>
-          <w:rFonts w:ascii="Arial" w:hAnsi="Arial" w:cs="Arial"/>
-          <w:b w:val="0"/>
-          <w:i/>
-        </w:rPr>
-        <w:t>Behaviour</w:t>
-      </w:r>
-      <w:proofErr w:type="spellEnd"/>
-      <w:r>
-        <w:rPr>
-          <w:rStyle w:val="fontstyle01"/>
-          <w:rFonts w:ascii="Arial" w:hAnsi="Arial" w:cs="Arial"/>
-          <w:b w:val="0"/>
-          <w:i/>
-        </w:rPr>
-        <w:t xml:space="preserve"> </w:t>
+        <w:t xml:space="preserve">Nat Hum Behaviour </w:t>
       </w:r>
       <w:r>
         <w:rPr>
@@ -4581,25 +4042,8 @@
           <w:rFonts w:ascii="Arial" w:eastAsia="Times New Roman" w:hAnsi="Arial" w:cs="Arial"/>
           <w:szCs w:val="24"/>
         </w:rPr>
-        <w:t xml:space="preserve">Zhang Y, et al. Mendelian </w:t>
-      </w:r>
-      <w:proofErr w:type="spellStart"/>
-      <w:r>
-        <w:rPr>
-          <w:rFonts w:ascii="Arial" w:eastAsia="Times New Roman" w:hAnsi="Arial" w:cs="Arial"/>
-          <w:szCs w:val="24"/>
-        </w:rPr>
-        <w:t>randomisation</w:t>
-      </w:r>
-      <w:proofErr w:type="spellEnd"/>
-      <w:r>
-        <w:rPr>
-          <w:rFonts w:ascii="Arial" w:eastAsia="Times New Roman" w:hAnsi="Arial" w:cs="Arial"/>
-          <w:szCs w:val="24"/>
-        </w:rPr>
-        <w:t xml:space="preserve"> highlights hypothyroidism as a causal determinant of idiopathic pulmonary fibrosis. </w:t>
-      </w:r>
-      <w:proofErr w:type="spellStart"/>
+        <w:t xml:space="preserve">Zhang Y, et al. Mendelian randomisation highlights hypothyroidism as a causal determinant of idiopathic pulmonary fibrosis. </w:t>
+      </w:r>
       <w:r>
         <w:rPr>
           <w:rFonts w:ascii="Arial" w:eastAsia="Times New Roman" w:hAnsi="Arial" w:cs="Arial"/>
@@ -4608,7 +4052,6 @@
         </w:rPr>
         <w:t>EBiomed</w:t>
       </w:r>
-      <w:proofErr w:type="spellEnd"/>
       <w:r>
         <w:rPr>
           <w:rFonts w:ascii="Arial" w:eastAsia="Times New Roman" w:hAnsi="Arial" w:cs="Arial"/>
@@ -5179,23 +4622,13 @@
         </w:rPr>
         <w:t>(</w:t>
       </w:r>
-      <w:proofErr w:type="spellStart"/>
       <w:r>
         <w:rPr>
           <w:rFonts w:ascii="Arial" w:hAnsi="Arial" w:cs="Arial"/>
           <w:color w:val="000000"/>
           <w:szCs w:val="24"/>
         </w:rPr>
-        <w:t>medRxiv</w:t>
-      </w:r>
-      <w:proofErr w:type="spellEnd"/>
-      <w:r>
-        <w:rPr>
-          <w:rFonts w:ascii="Arial" w:hAnsi="Arial" w:cs="Arial"/>
-          <w:color w:val="000000"/>
-          <w:szCs w:val="24"/>
-        </w:rPr>
-        <w:t xml:space="preserve">, </w:t>
+        <w:t xml:space="preserve">medRxiv, </w:t>
       </w:r>
       <w:r>
         <w:rPr>
@@ -5401,21 +4834,7 @@
         <w:rPr>
           <w:rFonts w:ascii="Arial" w:hAnsi="Arial" w:cs="Arial"/>
         </w:rPr>
-        <w:t xml:space="preserve">, et al. Mapping </w:t>
-      </w:r>
-      <w:proofErr w:type="spellStart"/>
-      <w:r>
-        <w:rPr>
-          <w:rFonts w:ascii="Arial" w:hAnsi="Arial" w:cs="Arial"/>
-        </w:rPr>
-        <w:t>pQTLs</w:t>
-      </w:r>
-      <w:proofErr w:type="spellEnd"/>
-      <w:r>
-        <w:rPr>
-          <w:rFonts w:ascii="Arial" w:hAnsi="Arial" w:cs="Arial"/>
-        </w:rPr>
-        <w:t xml:space="preserve"> of circulating inflammatory proteins identifies drivers of immune-mediated disease risk and novel therapeutic targets. </w:t>
+        <w:t xml:space="preserve">, et al. Mapping pQTLs of circulating inflammatory proteins identifies drivers of immune-mediated disease risk and novel therapeutic targets. </w:t>
       </w:r>
       <w:r>
         <w:rPr>
@@ -5568,7 +4987,6 @@
         </w:rPr>
         <w:t xml:space="preserve"> </w:t>
       </w:r>
-      <w:proofErr w:type="spellStart"/>
       <w:r>
         <w:rPr>
           <w:rFonts w:ascii="Arial" w:eastAsia="Times New Roman" w:hAnsi="Arial" w:cs="Arial"/>
@@ -5578,7 +4996,6 @@
         </w:rPr>
         <w:t>medRxiv</w:t>
       </w:r>
-      <w:proofErr w:type="spellEnd"/>
       <w:r>
         <w:rPr>
           <w:rFonts w:ascii="Arial" w:eastAsia="Times New Roman" w:hAnsi="Arial" w:cs="Arial"/>
@@ -5695,7 +5112,6 @@
         </w:rPr>
         <w:t xml:space="preserve">Macdonald-Dunlop E, et al. Mapping genetic determinants of 184 circulating proteins in 26,494 individuals to connect proteins and diseases. </w:t>
       </w:r>
-      <w:proofErr w:type="spellStart"/>
       <w:r>
         <w:rPr>
           <w:rFonts w:ascii="Arial" w:hAnsi="Arial" w:cs="Arial"/>
@@ -5705,7 +5121,6 @@
         </w:rPr>
         <w:t>medRxiv</w:t>
       </w:r>
-      <w:proofErr w:type="spellEnd"/>
       <w:r>
         <w:rPr>
           <w:rFonts w:ascii="Arial" w:hAnsi="Arial" w:cs="Arial"/>
@@ -5748,32 +5163,15 @@
           <w:rFonts w:ascii="Arial" w:hAnsi="Arial" w:cs="Arial"/>
           <w:bCs/>
         </w:rPr>
-        <w:t xml:space="preserve">Mendelian </w:t>
-      </w:r>
-      <w:proofErr w:type="spellStart"/>
+        <w:t>Mendelian randomisation identifies alternative splicing of the FAS death receptor as a mediator of severe COVID-19</w:t>
+      </w:r>
       <w:r>
         <w:rPr>
           <w:rFonts w:ascii="Arial" w:hAnsi="Arial" w:cs="Arial"/>
           <w:bCs/>
         </w:rPr>
-        <w:t>randomisation</w:t>
-      </w:r>
-      <w:proofErr w:type="spellEnd"/>
-      <w:r>
-        <w:rPr>
-          <w:rFonts w:ascii="Arial" w:hAnsi="Arial" w:cs="Arial"/>
-          <w:bCs/>
-        </w:rPr>
-        <w:t xml:space="preserve"> identifies alternative splicing of the FAS death receptor as a mediator of severe COVID-19</w:t>
-      </w:r>
-      <w:r>
-        <w:rPr>
-          <w:rFonts w:ascii="Arial" w:hAnsi="Arial" w:cs="Arial"/>
-          <w:bCs/>
-        </w:rPr>
         <w:t xml:space="preserve">. </w:t>
       </w:r>
-      <w:proofErr w:type="spellStart"/>
       <w:r>
         <w:rPr>
           <w:rFonts w:ascii="Arial" w:hAnsi="Arial" w:cs="Arial"/>
@@ -5783,7 +5181,6 @@
         </w:rPr>
         <w:t>medRxiv</w:t>
       </w:r>
-      <w:proofErr w:type="spellEnd"/>
       <w:r>
         <w:rPr>
           <w:rFonts w:ascii="Arial" w:hAnsi="Arial" w:cs="Arial"/>
@@ -5846,7 +5243,6 @@
         </w:rPr>
         <w:t xml:space="preserve">. </w:t>
       </w:r>
-      <w:proofErr w:type="spellStart"/>
       <w:r>
         <w:rPr>
           <w:rFonts w:ascii="Arial" w:eastAsia="Times New Roman" w:hAnsi="Arial" w:cs="Arial"/>
@@ -5861,7 +5257,6 @@
         </w:rPr>
         <w:t>edRxiv</w:t>
       </w:r>
-      <w:proofErr w:type="spellEnd"/>
       <w:r>
         <w:rPr>
           <w:rFonts w:ascii="Arial" w:eastAsia="Times New Roman" w:hAnsi="Arial" w:cs="Arial"/>
@@ -6149,21 +5544,12 @@
           <w:szCs w:val="24"/>
         </w:rPr>
       </w:pPr>
-      <w:proofErr w:type="spellStart"/>
-      <w:r>
-        <w:rPr>
-          <w:rFonts w:ascii="Arial" w:hAnsi="Arial" w:cs="Arial"/>
-          <w:szCs w:val="24"/>
-        </w:rPr>
-        <w:t>Koprulu</w:t>
-      </w:r>
-      <w:proofErr w:type="spellEnd"/>
-      <w:r>
-        <w:rPr>
-          <w:rFonts w:ascii="Arial" w:hAnsi="Arial" w:cs="Arial"/>
-          <w:szCs w:val="24"/>
-        </w:rPr>
-        <w:t xml:space="preserve"> M, et al. </w:t>
+      <w:r>
+        <w:rPr>
+          <w:rFonts w:ascii="Arial" w:hAnsi="Arial" w:cs="Arial"/>
+          <w:szCs w:val="24"/>
+        </w:rPr>
+        <w:t xml:space="preserve">Koprulu M, et al. </w:t>
       </w:r>
       <w:r>
         <w:rPr>
@@ -6171,18 +5557,8 @@
           <w:szCs w:val="24"/>
           <w:lang w:val="en-GB"/>
         </w:rPr>
-        <w:t xml:space="preserve">Multi-cohort proteogenomic analyses reveal genetic effects across the proteome and </w:t>
-      </w:r>
-      <w:proofErr w:type="spellStart"/>
-      <w:r>
-        <w:rPr>
-          <w:rFonts w:ascii="Arial" w:hAnsi="Arial" w:cs="Arial"/>
-          <w:szCs w:val="24"/>
-          <w:lang w:val="en-GB"/>
-        </w:rPr>
-        <w:t>diseasome</w:t>
-      </w:r>
-      <w:proofErr w:type="spellEnd"/>
+        <w:t>Multi-cohort proteogenomic analyses reveal genetic effects across the proteome and diseasome</w:t>
+      </w:r>
       <w:r>
         <w:rPr>
           <w:rFonts w:ascii="Arial" w:hAnsi="Arial" w:cs="Arial"/>
@@ -6407,23 +5783,7 @@
           <w:rFonts w:ascii="Arial" w:hAnsi="Arial" w:cs="Arial"/>
           <w:szCs w:val="24"/>
         </w:rPr>
-        <w:t xml:space="preserve">Needham EJ, Zhao JH, </w:t>
-      </w:r>
-      <w:proofErr w:type="spellStart"/>
-      <w:r>
-        <w:rPr>
-          <w:rFonts w:ascii="Arial" w:hAnsi="Arial" w:cs="Arial"/>
-          <w:szCs w:val="24"/>
-        </w:rPr>
-        <w:t>Hirschmüller</w:t>
-      </w:r>
-      <w:proofErr w:type="spellEnd"/>
-      <w:r>
-        <w:rPr>
-          <w:rFonts w:ascii="Arial" w:hAnsi="Arial" w:cs="Arial"/>
-          <w:szCs w:val="24"/>
-        </w:rPr>
-        <w:t xml:space="preserve"> N, Wolford C, Jiang X, Butterworth AS. Genetic determinants of protein phosphorylation in humans</w:t>
+        <w:t>Needham EJ, Zhao JH, Hirschmüller N, Wolford C, Jiang X, Butterworth AS. Genetic determinants of protein phosphorylation in humans</w:t>
       </w:r>
       <w:r>
         <w:rPr>
@@ -6439,15 +5799,13 @@
         </w:rPr>
         <w:t xml:space="preserve"> </w:t>
       </w:r>
-      <w:proofErr w:type="spellStart"/>
-      <w:r>
-        <w:rPr>
-          <w:rFonts w:ascii="Arial" w:hAnsi="Arial" w:cs="Arial"/>
-          <w:szCs w:val="24"/>
-        </w:rPr>
-        <w:t>doi</w:t>
-      </w:r>
-      <w:proofErr w:type="spellEnd"/>
+      <w:r>
+        <w:rPr>
+          <w:rFonts w:ascii="Arial" w:hAnsi="Arial" w:cs="Arial"/>
+          <w:szCs w:val="24"/>
+        </w:rPr>
+        <w:t>DOI</w:t>
+      </w:r>
       <w:r>
         <w:rPr>
           <w:rFonts w:ascii="Arial" w:hAnsi="Arial" w:cs="Arial"/>
@@ -8699,6 +8057,7 @@
   <w:style w:type="character" w:default="1" w:styleId="DefaultParagraphFont">
     <w:name w:val="Default Paragraph Font"/>
     <w:uiPriority w:val="1"/>
+    <w:semiHidden/>
     <w:unhideWhenUsed/>
   </w:style>
   <w:style w:type="table" w:default="1" w:styleId="TableNormal">

</xml_diff>